<commit_message>
LS changes finished. send to TH
</commit_message>
<xml_diff>
--- a/Revisions/Kouba_Fish_and_Ag_Benefit_MS_2026.05.12_LS.docx
+++ b/Revisions/Kouba_Fish_and_Ag_Benefit_MS_2026.05.12_LS.docx
@@ -2877,6 +2877,7 @@
         <w:pStyle w:val="BodyText"/>
       </w:pPr>
       <w:commentRangeStart w:id="114"/>
+      <w:commentRangeStart w:id="115"/>
       <w:r>
         <w:t>SGMA requires each local GSA to define sustainability in the negative, by quantifying and then avoiding “undesirable results” that would be “significant and unreasonable”. The central undesirable result in Scott Valley is streamflow depletion due to groundwater pumping</w:t>
       </w:r>
@@ -2889,6 +2890,13 @@
         </w:rPr>
         <w:commentReference w:id="114"/>
       </w:r>
+      <w:commentRangeEnd w:id="115"/>
+      <w:r>
+        <w:rPr>
+          <w:rStyle w:val="CommentReference"/>
+        </w:rPr>
+        <w:commentReference w:id="115"/>
+      </w:r>
       <w:r>
         <w:t>. Consequently, a central challenge of GSP development was balancing demands and determining the amount of (estimated) streamflow depletion that the GSA should aim to reverse, by accounting for environmental water demand versus the degree of water security that was owed to local agriculture.</w:t>
       </w:r>
@@ -2900,7 +2908,7 @@
       <w:r>
         <w:t xml:space="preserve">During GSP development, </w:t>
       </w:r>
-      <w:del w:id="115" w:author="Leland Scantlebury" w:date="2026-05-15T13:16:00Z" w16du:dateUtc="2026-05-15T20:16:00Z">
+      <w:del w:id="116" w:author="Leland Scantlebury" w:date="2026-05-15T13:16:00Z" w16du:dateUtc="2026-05-15T20:16:00Z">
         <w:r>
           <w:delText xml:space="preserve">the authors of this study simulated </w:delText>
         </w:r>
@@ -2916,7 +2924,7 @@
       <w:r>
         <w:t xml:space="preserve"> and water use scenarios </w:t>
       </w:r>
-      <w:ins w:id="116" w:author="Leland Scantlebury" w:date="2026-05-15T13:16:00Z" w16du:dateUtc="2026-05-15T20:16:00Z">
+      <w:ins w:id="117" w:author="Leland Scantlebury" w:date="2026-05-15T13:16:00Z" w16du:dateUtc="2026-05-15T20:16:00Z">
         <w:r>
           <w:t xml:space="preserve">were simulated </w:t>
         </w:r>
@@ -2924,23 +2932,23 @@
       <w:r>
         <w:t xml:space="preserve">to facilitate the comparison of management alternatives that could reduce streamflow depletion to various degrees. Simulations were conducted with a spatially explicit, </w:t>
       </w:r>
-      <w:commentRangeStart w:id="117"/>
+      <w:commentRangeStart w:id="118"/>
       <w:r>
         <w:t xml:space="preserve">integrated </w:t>
       </w:r>
-      <w:commentRangeEnd w:id="117"/>
+      <w:commentRangeEnd w:id="118"/>
       <w:r>
         <w:rPr>
           <w:rStyle w:val="CommentReference"/>
           <w:sz w:val="24"/>
           <w:szCs w:val="24"/>
         </w:rPr>
-        <w:commentReference w:id="117"/>
+        <w:commentReference w:id="118"/>
       </w:r>
       <w:r>
         <w:t xml:space="preserve">surface water-groundwater model (Tolley, Foglia, and Harter 2019), as described </w:t>
       </w:r>
-      <w:del w:id="118" w:author="Leland Scantlebury" w:date="2026-05-15T13:35:00Z" w16du:dateUtc="2026-05-15T20:35:00Z">
+      <w:del w:id="119" w:author="Leland Scantlebury" w:date="2026-05-15T13:35:00Z" w16du:dateUtc="2026-05-15T20:35:00Z">
         <w:r>
           <w:delText xml:space="preserve">below </w:delText>
         </w:r>
@@ -2953,7 +2961,7 @@
       <w:pPr>
         <w:pStyle w:val="Heading1"/>
       </w:pPr>
-      <w:bookmarkStart w:id="119" w:name="methods"/>
+      <w:bookmarkStart w:id="120" w:name="methods"/>
       <w:bookmarkEnd w:id="56"/>
       <w:bookmarkEnd w:id="111"/>
       <w:r>
@@ -2971,15 +2979,15 @@
       <w:pPr>
         <w:pStyle w:val="FirstParagraph"/>
         <w:rPr>
-          <w:del w:id="120" w:author="Leland Scantlebury" w:date="2026-05-15T13:45:00Z" w16du:dateUtc="2026-05-15T20:45:00Z"/>
+          <w:del w:id="121" w:author="Leland Scantlebury" w:date="2026-05-15T13:45:00Z" w16du:dateUtc="2026-05-15T20:45:00Z"/>
         </w:rPr>
       </w:pPr>
-      <w:del w:id="121" w:author="Leland Scantlebury" w:date="2026-05-15T13:40:00Z" w16du:dateUtc="2026-05-15T20:40:00Z">
+      <w:del w:id="122" w:author="Leland Scantlebury" w:date="2026-05-15T13:40:00Z" w16du:dateUtc="2026-05-15T20:40:00Z">
         <w:r>
           <w:delText xml:space="preserve">After </w:delText>
         </w:r>
       </w:del>
-      <w:ins w:id="122" w:author="Leland Scantlebury" w:date="2026-05-15T13:40:00Z" w16du:dateUtc="2026-05-15T20:40:00Z">
+      <w:ins w:id="123" w:author="Leland Scantlebury" w:date="2026-05-15T13:40:00Z" w16du:dateUtc="2026-05-15T20:40:00Z">
         <w:r>
           <w:t xml:space="preserve">Building on the </w:t>
         </w:r>
@@ -2987,7 +2995,7 @@
       <w:r>
         <w:t>2021</w:t>
       </w:r>
-      <w:ins w:id="123" w:author="Leland Scantlebury" w:date="2026-05-15T13:40:00Z" w16du:dateUtc="2026-05-15T20:40:00Z">
+      <w:ins w:id="124" w:author="Leland Scantlebury" w:date="2026-05-15T13:40:00Z" w16du:dateUtc="2026-05-15T20:40:00Z">
         <w:r>
           <w:t xml:space="preserve"> GSP planning process</w:t>
         </w:r>
@@ -2995,22 +3003,22 @@
       <w:r>
         <w:t xml:space="preserve">, we </w:t>
       </w:r>
-      <w:del w:id="124" w:author="Leland Scantlebury" w:date="2026-05-15T13:40:00Z" w16du:dateUtc="2026-05-15T20:40:00Z">
+      <w:del w:id="125" w:author="Leland Scantlebury" w:date="2026-05-15T13:40:00Z" w16du:dateUtc="2026-05-15T20:40:00Z">
         <w:r>
           <w:delText xml:space="preserve">expanded </w:delText>
         </w:r>
       </w:del>
-      <w:ins w:id="125" w:author="Leland Scantlebury" w:date="2026-05-15T13:40:00Z" w16du:dateUtc="2026-05-15T20:40:00Z">
+      <w:ins w:id="126" w:author="Leland Scantlebury" w:date="2026-05-15T13:40:00Z" w16du:dateUtc="2026-05-15T20:40:00Z">
         <w:r>
           <w:t xml:space="preserve">evaluated </w:t>
         </w:r>
       </w:ins>
-      <w:del w:id="126" w:author="Leland Scantlebury" w:date="2026-05-15T13:43:00Z" w16du:dateUtc="2026-05-15T20:43:00Z">
+      <w:del w:id="127" w:author="Leland Scantlebury" w:date="2026-05-15T13:43:00Z" w16du:dateUtc="2026-05-15T20:43:00Z">
         <w:r>
           <w:delText>on this public planning effort with a research study, based on the</w:delText>
         </w:r>
       </w:del>
-      <w:ins w:id="127" w:author="Leland Scantlebury" w:date="2026-05-15T13:43:00Z" w16du:dateUtc="2026-05-15T20:43:00Z">
+      <w:ins w:id="128" w:author="Leland Scantlebury" w:date="2026-05-15T13:43:00Z" w16du:dateUtc="2026-05-15T20:43:00Z">
         <w:r>
           <w:t>a</w:t>
         </w:r>
@@ -3018,7 +3026,7 @@
       <w:r>
         <w:t xml:space="preserve"> suite of management scenarios designed for the GSP</w:t>
       </w:r>
-      <w:del w:id="128" w:author="Leland Scantlebury" w:date="2026-05-15T13:43:00Z" w16du:dateUtc="2026-05-15T20:43:00Z">
+      <w:del w:id="129" w:author="Leland Scantlebury" w:date="2026-05-15T13:43:00Z" w16du:dateUtc="2026-05-15T20:43:00Z">
         <w:r>
           <w:delText>,</w:delText>
         </w:r>
@@ -3026,7 +3034,7 @@
       <w:r>
         <w:t xml:space="preserve"> in the hopes that it could inform water management decisions during 5-year GSP updates over the coming decades.</w:t>
       </w:r>
-      <w:ins w:id="129" w:author="Leland Scantlebury" w:date="2026-05-15T13:45:00Z" w16du:dateUtc="2026-05-15T20:45:00Z">
+      <w:ins w:id="130" w:author="Leland Scantlebury" w:date="2026-05-15T13:45:00Z" w16du:dateUtc="2026-05-15T20:45:00Z">
         <w:r>
           <w:t xml:space="preserve"> </w:t>
         </w:r>
@@ -3035,13 +3043,13 @@
     <w:p>
       <w:pPr>
         <w:pStyle w:val="FirstParagraph"/>
-        <w:pPrChange w:id="130" w:author="Leland Scantlebury" w:date="2026-05-15T13:45:00Z" w16du:dateUtc="2026-05-15T20:45:00Z">
+        <w:pPrChange w:id="131" w:author="Leland Scantlebury" w:date="2026-05-15T13:45:00Z" w16du:dateUtc="2026-05-15T20:45:00Z">
           <w:pPr>
             <w:pStyle w:val="BodyText"/>
           </w:pPr>
         </w:pPrChange>
       </w:pPr>
-      <w:ins w:id="131" w:author="Leland Scantlebury" w:date="2026-05-15T13:43:00Z" w16du:dateUtc="2026-05-15T20:43:00Z">
+      <w:ins w:id="132" w:author="Leland Scantlebury" w:date="2026-05-15T13:43:00Z" w16du:dateUtc="2026-05-15T20:43:00Z">
         <w:r>
           <w:t xml:space="preserve">The </w:t>
         </w:r>
@@ -3049,12 +3057,12 @@
           <w:t>basis for evalua</w:t>
         </w:r>
       </w:ins>
-      <w:ins w:id="132" w:author="Leland Scantlebury" w:date="2026-05-15T13:44:00Z" w16du:dateUtc="2026-05-15T20:44:00Z">
+      <w:ins w:id="133" w:author="Leland Scantlebury" w:date="2026-05-15T13:44:00Z" w16du:dateUtc="2026-05-15T20:44:00Z">
         <w:r>
           <w:t>tion was</w:t>
         </w:r>
       </w:ins>
-      <w:del w:id="133" w:author="Leland Scantlebury" w:date="2026-05-15T13:43:00Z" w16du:dateUtc="2026-05-15T20:43:00Z">
+      <w:del w:id="134" w:author="Leland Scantlebury" w:date="2026-05-15T13:43:00Z" w16du:dateUtc="2026-05-15T20:43:00Z">
         <w:r>
           <w:delText>In particular, we</w:delText>
         </w:r>
@@ -3062,7 +3070,7 @@
       <w:r>
         <w:t xml:space="preserve"> </w:t>
       </w:r>
-      <w:del w:id="134" w:author="Leland Scantlebury" w:date="2026-05-15T13:44:00Z" w16du:dateUtc="2026-05-15T20:44:00Z">
+      <w:del w:id="135" w:author="Leland Scantlebury" w:date="2026-05-15T13:44:00Z" w16du:dateUtc="2026-05-15T20:44:00Z">
         <w:r>
           <w:delText xml:space="preserve">developed </w:delText>
         </w:r>
@@ -3070,12 +3078,12 @@
       <w:r>
         <w:t xml:space="preserve">two quantitative objective </w:t>
       </w:r>
-      <w:del w:id="135" w:author="Leland Scantlebury" w:date="2026-05-15T13:44:00Z" w16du:dateUtc="2026-05-15T20:44:00Z">
+      <w:del w:id="136" w:author="Leland Scantlebury" w:date="2026-05-15T13:44:00Z" w16du:dateUtc="2026-05-15T20:44:00Z">
         <w:r>
           <w:delText xml:space="preserve">functions </w:delText>
         </w:r>
       </w:del>
-      <w:ins w:id="136" w:author="Leland Scantlebury" w:date="2026-05-15T13:44:00Z" w16du:dateUtc="2026-05-15T20:44:00Z">
+      <w:ins w:id="137" w:author="Leland Scantlebury" w:date="2026-05-15T13:44:00Z" w16du:dateUtc="2026-05-15T20:44:00Z">
         <w:r>
           <w:t xml:space="preserve">metrics </w:t>
         </w:r>
@@ -3128,18 +3136,26 @@
       <w:r>
         <w:t xml:space="preserve">We then applied these to the results of each simulated management </w:t>
       </w:r>
-      <w:commentRangeStart w:id="137"/>
+      <w:commentRangeStart w:id="138"/>
+      <w:commentRangeStart w:id="139"/>
       <w:r>
         <w:t>scenario</w:t>
       </w:r>
-      <w:commentRangeEnd w:id="137"/>
+      <w:commentRangeEnd w:id="138"/>
       <w:r>
         <w:rPr>
           <w:rStyle w:val="CommentReference"/>
           <w:sz w:val="24"/>
           <w:szCs w:val="24"/>
         </w:rPr>
-        <w:commentReference w:id="137"/>
+        <w:commentReference w:id="138"/>
+      </w:r>
+      <w:commentRangeEnd w:id="139"/>
+      <w:r>
+        <w:rPr>
+          <w:rStyle w:val="CommentReference"/>
+        </w:rPr>
+        <w:commentReference w:id="139"/>
       </w:r>
       <w:r>
         <w:t>, found the Pareto-optimal set of scenarios, and compared them to the prioritization of management actions adopted in the GSP (Siskiyou County 2021).</w:t>
@@ -3149,8 +3165,8 @@
       <w:pPr>
         <w:pStyle w:val="TableCaption"/>
       </w:pPr>
-      <w:bookmarkStart w:id="138" w:name="tab:objFunctionTable"/>
-      <w:bookmarkEnd w:id="138"/>
+      <w:bookmarkStart w:id="140" w:name="tab:objFunctionTable"/>
+      <w:bookmarkEnd w:id="140"/>
       <w:r>
         <w:t>Table 2: Management objectives and description of objective functions applied to summarize scenario performance.</w:t>
       </w:r>
@@ -3514,7 +3530,7 @@
       <w:pPr>
         <w:pStyle w:val="Heading2"/>
       </w:pPr>
-      <w:bookmarkStart w:id="139" w:name="objective-functions"/>
+      <w:bookmarkStart w:id="141" w:name="objective-functions"/>
       <w:r>
         <w:rPr>
           <w:rStyle w:val="SectionNumber"/>
@@ -3530,7 +3546,7 @@
       <w:pPr>
         <w:pStyle w:val="Heading3"/>
       </w:pPr>
-      <w:bookmarkStart w:id="140" w:name="hydrologic-benefit-function"/>
+      <w:bookmarkStart w:id="142" w:name="hydrologic-benefit-function"/>
       <w:r>
         <w:rPr>
           <w:rStyle w:val="SectionNumber"/>
@@ -3554,17 +3570,17 @@
       <w:pPr>
         <w:pStyle w:val="BodyText"/>
       </w:pPr>
-      <w:ins w:id="141" w:author="Leland Scantlebury" w:date="2026-05-15T15:22:00Z" w16du:dateUtc="2026-05-15T22:22:00Z">
+      <w:ins w:id="143" w:author="Leland Scantlebury" w:date="2026-05-15T15:22:00Z" w16du:dateUtc="2026-05-15T22:22:00Z">
         <w:r>
           <w:t xml:space="preserve">Previously </w:t>
         </w:r>
       </w:ins>
-      <w:del w:id="142" w:author="Leland Scantlebury" w:date="2026-05-15T15:22:00Z" w16du:dateUtc="2026-05-15T22:22:00Z">
+      <w:del w:id="144" w:author="Leland Scantlebury" w:date="2026-05-15T15:22:00Z" w16du:dateUtc="2026-05-15T22:22:00Z">
         <w:r>
           <w:delText>I</w:delText>
         </w:r>
       </w:del>
-      <w:ins w:id="143" w:author="Leland Scantlebury" w:date="2026-05-15T15:22:00Z" w16du:dateUtc="2026-05-15T22:22:00Z">
+      <w:ins w:id="145" w:author="Leland Scantlebury" w:date="2026-05-15T15:22:00Z" w16du:dateUtc="2026-05-15T22:22:00Z">
         <w:r>
           <w:t>i</w:t>
         </w:r>
@@ -3572,12 +3588,12 @@
       <w:r>
         <w:t xml:space="preserve">n </w:t>
       </w:r>
-      <w:del w:id="144" w:author="Leland Scantlebury" w:date="2026-05-15T15:22:00Z" w16du:dateUtc="2026-05-15T22:22:00Z">
+      <w:del w:id="146" w:author="Leland Scantlebury" w:date="2026-05-15T15:22:00Z" w16du:dateUtc="2026-05-15T22:22:00Z">
         <w:r>
           <w:delText>a previous study</w:delText>
         </w:r>
       </w:del>
-      <w:ins w:id="145" w:author="Leland Scantlebury" w:date="2026-05-15T15:22:00Z" w16du:dateUtc="2026-05-15T22:22:00Z">
+      <w:ins w:id="147" w:author="Leland Scantlebury" w:date="2026-05-15T15:22:00Z" w16du:dateUtc="2026-05-15T22:22:00Z">
         <w:r>
           <w:t>Kouba et al. (2025)</w:t>
         </w:r>
@@ -3585,7 +3601,7 @@
       <w:r>
         <w:t xml:space="preserve">, </w:t>
       </w:r>
-      <w:del w:id="146" w:author="Leland Scantlebury" w:date="2026-05-15T15:22:00Z" w16du:dateUtc="2026-05-15T22:22:00Z">
+      <w:del w:id="148" w:author="Leland Scantlebury" w:date="2026-05-15T15:22:00Z" w16du:dateUtc="2026-05-15T22:22:00Z">
         <w:r>
           <w:delText xml:space="preserve">we empirically identified </w:delText>
         </w:r>
@@ -3593,12 +3609,12 @@
       <w:r>
         <w:t>hydrograph features of high importance to Scott River coho and Chinook</w:t>
       </w:r>
-      <w:ins w:id="147" w:author="Leland Scantlebury" w:date="2026-05-15T15:22:00Z" w16du:dateUtc="2026-05-15T22:22:00Z">
+      <w:ins w:id="149" w:author="Leland Scantlebury" w:date="2026-05-15T15:22:00Z" w16du:dateUtc="2026-05-15T22:22:00Z">
         <w:r>
           <w:t xml:space="preserve"> were empirically identified</w:t>
         </w:r>
       </w:ins>
-      <w:del w:id="148" w:author="Leland Scantlebury" w:date="2026-05-15T15:22:00Z" w16du:dateUtc="2026-05-15T22:22:00Z">
+      <w:del w:id="150" w:author="Leland Scantlebury" w:date="2026-05-15T15:22:00Z" w16du:dateUtc="2026-05-15T22:22:00Z">
         <w:r>
           <w:delText>,</w:delText>
         </w:r>
@@ -3614,7 +3630,7 @@
       <w:r>
         <w:t xml:space="preserve"> juvenile abundance</w:t>
       </w:r>
-      <w:ins w:id="149" w:author="Leland Scantlebury" w:date="2026-05-15T15:23:00Z" w16du:dateUtc="2026-05-15T22:23:00Z">
+      <w:ins w:id="151" w:author="Leland Scantlebury" w:date="2026-05-15T15:23:00Z" w16du:dateUtc="2026-05-15T22:23:00Z">
         <w:r>
           <w:t>.</w:t>
         </w:r>
@@ -3622,12 +3638,12 @@
       <w:r>
         <w:t xml:space="preserve"> </w:t>
       </w:r>
-      <w:del w:id="150" w:author="Leland Scantlebury" w:date="2026-05-15T15:23:00Z" w16du:dateUtc="2026-05-15T22:23:00Z">
+      <w:del w:id="152" w:author="Leland Scantlebury" w:date="2026-05-15T15:23:00Z" w16du:dateUtc="2026-05-15T22:23:00Z">
         <w:r>
           <w:delText>(</w:delText>
         </w:r>
       </w:del>
-      <w:del w:id="151" w:author="Leland Scantlebury" w:date="2026-05-15T15:22:00Z" w16du:dateUtc="2026-05-15T22:22:00Z">
+      <w:del w:id="153" w:author="Leland Scantlebury" w:date="2026-05-15T15:22:00Z" w16du:dateUtc="2026-05-15T22:22:00Z">
         <w:r>
           <w:delText xml:space="preserve">Kouba et al. 2025). </w:delText>
         </w:r>
@@ -3663,12 +3679,12 @@
       <w:r>
         <w:t xml:space="preserve"> hydrologic factors. Importantly, the HB functions developed in </w:t>
       </w:r>
-      <w:del w:id="152" w:author="Leland Scantlebury" w:date="2026-05-15T15:21:00Z" w16du:dateUtc="2026-05-15T22:21:00Z">
+      <w:del w:id="154" w:author="Leland Scantlebury" w:date="2026-05-15T15:21:00Z" w16du:dateUtc="2026-05-15T22:21:00Z">
         <w:r>
           <w:delText>this exercise</w:delText>
         </w:r>
       </w:del>
-      <w:ins w:id="153" w:author="Leland Scantlebury" w:date="2026-05-15T15:21:00Z" w16du:dateUtc="2026-05-15T22:21:00Z">
+      <w:ins w:id="155" w:author="Leland Scantlebury" w:date="2026-05-15T15:21:00Z" w16du:dateUtc="2026-05-15T22:21:00Z">
         <w:r>
           <w:t>Kouba et al. (2025)</w:t>
         </w:r>
@@ -3686,7 +3702,7 @@
       <w:r>
         <w:t xml:space="preserve"> of variation in observed smolt abundance, and the remaining 60%-40% of variation is assumed related to other life conditions, e.g., number of returning spawners, water quality, food resources, and internal fishery population dynamics</w:t>
       </w:r>
-      <w:del w:id="154" w:author="Leland Scantlebury" w:date="2026-05-15T15:23:00Z" w16du:dateUtc="2026-05-15T22:23:00Z">
+      <w:del w:id="156" w:author="Leland Scantlebury" w:date="2026-05-15T15:23:00Z" w16du:dateUtc="2026-05-15T22:23:00Z">
         <w:r>
           <w:delText xml:space="preserve"> (Kouba et al. 2025)</w:delText>
         </w:r>
@@ -3727,7 +3743,7 @@
       <w:r>
         <w:t>The example HB function highlighted here is based on coho juvenile outmigrant abundance. It predicts that a higher number of coho smolt produced (coho smolt-equivalent) is related to higher fall flows during a cohort’s parents’ spawning, lower fall flows during a cohort’s time as overwintering yearlings, and a slower spring recession during outmigration (</w:t>
       </w:r>
-      <w:del w:id="155" w:author="Leland Scantlebury" w:date="2026-05-15T15:24:00Z" w16du:dateUtc="2026-05-15T22:24:00Z">
+      <w:del w:id="157" w:author="Leland Scantlebury" w:date="2026-05-15T15:24:00Z" w16du:dateUtc="2026-05-15T22:24:00Z">
         <w:r>
           <w:delText xml:space="preserve">see coefficient values in </w:delText>
         </w:r>
@@ -3740,17 +3756,17 @@
       <w:pPr>
         <w:pStyle w:val="TableCaption"/>
       </w:pPr>
-      <w:bookmarkStart w:id="156" w:name="tab:coefTabMainText"/>
-      <w:bookmarkEnd w:id="156"/>
+      <w:bookmarkStart w:id="158" w:name="tab:coefTabMainText"/>
+      <w:bookmarkEnd w:id="158"/>
       <w:r>
         <w:t xml:space="preserve">Table 3: Coefficients for the Hydrologic Benefit function, an </w:t>
       </w:r>
-      <w:del w:id="157" w:author="Leland Scantlebury" w:date="2026-05-15T15:49:00Z" w16du:dateUtc="2026-05-15T22:49:00Z">
+      <w:del w:id="159" w:author="Leland Scantlebury" w:date="2026-05-15T15:49:00Z" w16du:dateUtc="2026-05-15T22:49:00Z">
         <w:r>
           <w:delText>emperical</w:delText>
         </w:r>
       </w:del>
-      <w:ins w:id="158" w:author="Leland Scantlebury" w:date="2026-05-15T15:49:00Z" w16du:dateUtc="2026-05-15T22:49:00Z">
+      <w:ins w:id="160" w:author="Leland Scantlebury" w:date="2026-05-15T15:49:00Z" w16du:dateUtc="2026-05-15T22:49:00Z">
         <w:r>
           <w:t>empirical</w:t>
         </w:r>
@@ -4509,17 +4525,17 @@
       <w:r>
         <w:t xml:space="preserve">). </w:t>
       </w:r>
-      <w:del w:id="159" w:author="Leland Scantlebury" w:date="2026-05-15T15:27:00Z" w16du:dateUtc="2026-05-15T22:27:00Z">
+      <w:del w:id="161" w:author="Leland Scantlebury" w:date="2026-05-15T15:27:00Z" w16du:dateUtc="2026-05-15T22:27:00Z">
         <w:r>
           <w:delText>However, although SVIHM was extensively calibrated (Tolley, Foglia, and Harter 2019), b</w:delText>
         </w:r>
       </w:del>
-      <w:ins w:id="160" w:author="Leland Scantlebury" w:date="2026-05-15T15:32:00Z" w16du:dateUtc="2026-05-15T22:32:00Z">
+      <w:ins w:id="162" w:author="Leland Scantlebury" w:date="2026-05-15T15:32:00Z" w16du:dateUtc="2026-05-15T22:32:00Z">
         <w:r>
           <w:t>Although SVIHM</w:t>
         </w:r>
       </w:ins>
-      <w:ins w:id="161" w:author="Leland Scantlebury" w:date="2026-05-15T15:33:00Z" w16du:dateUtc="2026-05-15T22:33:00Z">
+      <w:ins w:id="163" w:author="Leland Scantlebury" w:date="2026-05-15T15:33:00Z" w16du:dateUtc="2026-05-15T22:33:00Z">
         <w:r>
           <w:t xml:space="preserve"> was cal</w:t>
         </w:r>
@@ -4527,27 +4543,27 @@
           <w:t>ibrated to match historical observations (Tolley, Foglia, and Harter 2019)</w:t>
         </w:r>
       </w:ins>
-      <w:ins w:id="162" w:author="Leland Scantlebury" w:date="2026-05-15T15:37:00Z" w16du:dateUtc="2026-05-15T22:37:00Z">
+      <w:ins w:id="164" w:author="Leland Scantlebury" w:date="2026-05-15T15:37:00Z" w16du:dateUtc="2026-05-15T22:37:00Z">
         <w:r>
           <w:t>,</w:t>
         </w:r>
       </w:ins>
-      <w:ins w:id="163" w:author="Leland Scantlebury" w:date="2026-05-15T15:33:00Z" w16du:dateUtc="2026-05-15T22:33:00Z">
+      <w:ins w:id="165" w:author="Leland Scantlebury" w:date="2026-05-15T15:33:00Z" w16du:dateUtc="2026-05-15T22:33:00Z">
         <w:r>
           <w:t xml:space="preserve"> differences between </w:t>
         </w:r>
       </w:ins>
-      <w:del w:id="164" w:author="Leland Scantlebury" w:date="2026-05-15T15:32:00Z" w16du:dateUtc="2026-05-15T22:32:00Z">
+      <w:del w:id="166" w:author="Leland Scantlebury" w:date="2026-05-15T15:32:00Z" w16du:dateUtc="2026-05-15T22:32:00Z">
         <w:r>
           <w:delText xml:space="preserve">ecause all models involve structural simplifications of </w:delText>
         </w:r>
       </w:del>
-      <w:del w:id="165" w:author="Leland Scantlebury" w:date="2026-05-15T15:27:00Z" w16du:dateUtc="2026-05-15T22:27:00Z">
+      <w:del w:id="167" w:author="Leland Scantlebury" w:date="2026-05-15T15:27:00Z" w16du:dateUtc="2026-05-15T22:27:00Z">
         <w:r>
           <w:delText>a full-scale watershed</w:delText>
         </w:r>
       </w:del>
-      <w:del w:id="166" w:author="Leland Scantlebury" w:date="2026-05-15T15:33:00Z" w16du:dateUtc="2026-05-15T22:33:00Z">
+      <w:del w:id="168" w:author="Leland Scantlebury" w:date="2026-05-15T15:33:00Z" w16du:dateUtc="2026-05-15T22:33:00Z">
         <w:r>
           <w:delText xml:space="preserve">, </w:delText>
         </w:r>
@@ -4603,12 +4619,12 @@
       <w:r>
         <w:t xml:space="preserve"> </w:t>
       </w:r>
-      <w:del w:id="167" w:author="Leland Scantlebury" w:date="2026-05-15T15:34:00Z" w16du:dateUtc="2026-05-15T22:34:00Z">
+      <w:del w:id="169" w:author="Leland Scantlebury" w:date="2026-05-15T15:34:00Z" w16du:dateUtc="2026-05-15T22:34:00Z">
         <w:r>
           <w:delText>sometimes over- or under-estimates</w:delText>
         </w:r>
       </w:del>
-      <w:ins w:id="168" w:author="Leland Scantlebury" w:date="2026-05-15T15:34:00Z" w16du:dateUtc="2026-05-15T22:34:00Z">
+      <w:ins w:id="170" w:author="Leland Scantlebury" w:date="2026-05-15T15:34:00Z" w16du:dateUtc="2026-05-15T22:34:00Z">
         <w:r>
           <w:t>and</w:t>
         </w:r>
@@ -4649,7 +4665,7 @@
           </m:sub>
         </m:sSub>
       </m:oMath>
-      <w:ins w:id="169" w:author="Leland Scantlebury" w:date="2026-05-15T15:34:00Z" w16du:dateUtc="2026-05-15T22:34:00Z">
+      <w:ins w:id="171" w:author="Leland Scantlebury" w:date="2026-05-15T15:34:00Z" w16du:dateUtc="2026-05-15T22:34:00Z">
         <w:r>
           <w:rPr>
             <w:rFonts w:eastAsiaTheme="minorEastAsia"/>
@@ -4657,7 +4673,7 @@
           <w:t xml:space="preserve"> are expected because </w:t>
         </w:r>
       </w:ins>
-      <w:ins w:id="170" w:author="Leland Scantlebury" w:date="2026-05-15T15:39:00Z" w16du:dateUtc="2026-05-15T22:39:00Z">
+      <w:ins w:id="172" w:author="Leland Scantlebury" w:date="2026-05-15T15:39:00Z" w16du:dateUtc="2026-05-15T22:39:00Z">
         <w:r>
           <w:rPr>
             <w:rFonts w:eastAsiaTheme="minorEastAsia"/>
@@ -4665,7 +4681,7 @@
           <w:t xml:space="preserve">watershed </w:t>
         </w:r>
       </w:ins>
-      <w:ins w:id="171" w:author="Leland Scantlebury" w:date="2026-05-15T15:37:00Z" w16du:dateUtc="2026-05-15T22:37:00Z">
+      <w:ins w:id="173" w:author="Leland Scantlebury" w:date="2026-05-15T15:37:00Z" w16du:dateUtc="2026-05-15T22:37:00Z">
         <w:r>
           <w:rPr>
             <w:rFonts w:eastAsiaTheme="minorEastAsia"/>
@@ -4673,7 +4689,7 @@
           <w:t xml:space="preserve">models are simplified </w:t>
         </w:r>
       </w:ins>
-      <w:ins w:id="172" w:author="Leland Scantlebury" w:date="2026-05-15T15:43:00Z" w16du:dateUtc="2026-05-15T22:43:00Z">
+      <w:ins w:id="174" w:author="Leland Scantlebury" w:date="2026-05-15T15:43:00Z" w16du:dateUtc="2026-05-15T22:43:00Z">
         <w:r>
           <w:rPr>
             <w:rFonts w:eastAsiaTheme="minorEastAsia"/>
@@ -4681,7 +4697,7 @@
           <w:t>representations</w:t>
         </w:r>
       </w:ins>
-      <w:ins w:id="173" w:author="Leland Scantlebury" w:date="2026-05-15T15:37:00Z" w16du:dateUtc="2026-05-15T22:37:00Z">
+      <w:ins w:id="175" w:author="Leland Scantlebury" w:date="2026-05-15T15:37:00Z" w16du:dateUtc="2026-05-15T22:37:00Z">
         <w:r>
           <w:rPr>
             <w:rFonts w:eastAsiaTheme="minorEastAsia"/>
@@ -4689,7 +4705,7 @@
           <w:t xml:space="preserve"> of </w:t>
         </w:r>
       </w:ins>
-      <w:ins w:id="174" w:author="Leland Scantlebury" w:date="2026-05-15T15:43:00Z" w16du:dateUtc="2026-05-15T22:43:00Z">
+      <w:ins w:id="176" w:author="Leland Scantlebury" w:date="2026-05-15T15:43:00Z" w16du:dateUtc="2026-05-15T22:43:00Z">
         <w:r>
           <w:rPr>
             <w:rFonts w:eastAsiaTheme="minorEastAsia"/>
@@ -4697,14 +4713,14 @@
           <w:t>complex natural systems</w:t>
         </w:r>
       </w:ins>
-      <w:ins w:id="175" w:author="Leland Scantlebury" w:date="2026-05-15T15:47:00Z" w16du:dateUtc="2026-05-15T22:47:00Z">
+      <w:ins w:id="177" w:author="Leland Scantlebury" w:date="2026-05-15T15:47:00Z" w16du:dateUtc="2026-05-15T22:47:00Z">
         <w:r>
           <w:rPr>
             <w:rFonts w:eastAsiaTheme="minorEastAsia"/>
           </w:rPr>
           <w:t xml:space="preserve"> </w:t>
         </w:r>
-        <w:commentRangeStart w:id="176"/>
+        <w:commentRangeStart w:id="178"/>
         <w:r>
           <w:rPr>
             <w:rFonts w:eastAsiaTheme="minorEastAsia"/>
@@ -4712,7 +4728,7 @@
           <w:t>(Doherty &amp; Welter, 2010)</w:t>
         </w:r>
       </w:ins>
-      <w:ins w:id="177" w:author="Leland Scantlebury" w:date="2026-05-15T15:37:00Z" w16du:dateUtc="2026-05-15T22:37:00Z">
+      <w:ins w:id="179" w:author="Leland Scantlebury" w:date="2026-05-15T15:37:00Z" w16du:dateUtc="2026-05-15T22:37:00Z">
         <w:r>
           <w:rPr>
             <w:rFonts w:eastAsiaTheme="minorEastAsia"/>
@@ -4720,7 +4736,7 @@
           <w:t>,</w:t>
         </w:r>
       </w:ins>
-      <w:ins w:id="178" w:author="Leland Scantlebury" w:date="2026-05-15T15:39:00Z" w16du:dateUtc="2026-05-15T22:39:00Z">
+      <w:ins w:id="180" w:author="Leland Scantlebury" w:date="2026-05-15T15:39:00Z" w16du:dateUtc="2026-05-15T22:39:00Z">
         <w:r>
           <w:rPr>
             <w:rFonts w:eastAsiaTheme="minorEastAsia"/>
@@ -4728,7 +4744,7 @@
           <w:t xml:space="preserve"> </w:t>
         </w:r>
       </w:ins>
-      <w:commentRangeEnd w:id="176"/>
+      <w:commentRangeEnd w:id="178"/>
       <w:r>
         <w:rPr>
           <w:rStyle w:val="CommentReference"/>
@@ -4736,9 +4752,9 @@
           <w:sz w:val="24"/>
           <w:szCs w:val="24"/>
         </w:rPr>
-        <w:commentReference w:id="176"/>
-      </w:r>
-      <w:ins w:id="179" w:author="Leland Scantlebury" w:date="2026-05-15T15:39:00Z" w16du:dateUtc="2026-05-15T22:39:00Z">
+        <w:commentReference w:id="178"/>
+      </w:r>
+      <w:ins w:id="181" w:author="Leland Scantlebury" w:date="2026-05-15T15:39:00Z" w16du:dateUtc="2026-05-15T22:39:00Z">
         <w:r>
           <w:rPr>
             <w:rFonts w:eastAsiaTheme="minorEastAsia"/>
@@ -4746,7 +4762,7 @@
           <w:t>and because streamflow observations contain</w:t>
         </w:r>
       </w:ins>
-      <w:ins w:id="180" w:author="Leland Scantlebury" w:date="2026-05-15T15:37:00Z" w16du:dateUtc="2026-05-15T22:37:00Z">
+      <w:ins w:id="182" w:author="Leland Scantlebury" w:date="2026-05-15T15:37:00Z" w16du:dateUtc="2026-05-15T22:37:00Z">
         <w:r>
           <w:rPr>
             <w:rFonts w:eastAsiaTheme="minorEastAsia"/>
@@ -4754,7 +4770,7 @@
           <w:t xml:space="preserve"> </w:t>
         </w:r>
       </w:ins>
-      <w:ins w:id="181" w:author="Leland Scantlebury" w:date="2026-05-15T15:35:00Z" w16du:dateUtc="2026-05-15T22:35:00Z">
+      <w:ins w:id="183" w:author="Leland Scantlebury" w:date="2026-05-15T15:35:00Z" w16du:dateUtc="2026-05-15T22:35:00Z">
         <w:r>
           <w:rPr>
             <w:rFonts w:eastAsiaTheme="minorEastAsia"/>
@@ -4829,8 +4845,8 @@
       <w:pPr>
         <w:pStyle w:val="Heading3"/>
       </w:pPr>
-      <w:bookmarkStart w:id="182" w:name="Xb6ca5dd654202e76d1db9f1bc12c98cced9d6aa"/>
-      <w:bookmarkEnd w:id="140"/>
+      <w:bookmarkStart w:id="184" w:name="Xb6ca5dd654202e76d1db9f1bc12c98cced9d6aa"/>
+      <w:bookmarkEnd w:id="142"/>
       <w:r>
         <w:rPr>
           <w:rStyle w:val="SectionNumber"/>
@@ -4850,18 +4866,26 @@
       <w:r>
         <w:t xml:space="preserve">The annual crop ET volume, which is explicitly simulated in the hydrologic model, is used here as a proxy for agricultural productivity. Other options for framing the agricultural water use objective function include crop yields and total revenue, which may be of greater concern to stakeholders; however, </w:t>
       </w:r>
-      <w:commentRangeStart w:id="183"/>
+      <w:commentRangeStart w:id="185"/>
+      <w:commentRangeStart w:id="186"/>
       <w:r>
         <w:t>annual crop ET was selected because the impacts of reduced water availability on yield or revenue will likely vary by grower and over time.</w:t>
       </w:r>
-      <w:commentRangeEnd w:id="183"/>
+      <w:commentRangeEnd w:id="185"/>
       <w:r>
         <w:rPr>
           <w:rStyle w:val="CommentReference"/>
           <w:sz w:val="24"/>
           <w:szCs w:val="24"/>
         </w:rPr>
-        <w:commentReference w:id="183"/>
+        <w:commentReference w:id="185"/>
+      </w:r>
+      <w:commentRangeEnd w:id="186"/>
+      <w:r>
+        <w:rPr>
+          <w:rStyle w:val="CommentReference"/>
+        </w:rPr>
+        <w:commentReference w:id="186"/>
       </w:r>
     </w:p>
     <w:p>
@@ -4871,12 +4895,12 @@
       <w:r>
         <w:t>Additionally, for alfalfa and pasture, which continue growing as long as water is available, a strong relationship between crop ET and yield is assumed (Carter and Sheaffer 1983). However, we assume that grain, another important local crop, has a different relationship than alfalfa between ET and revenue, as grain is harvested once per year in mid-to-late summer and alfalfa is harvested three to four times per year in this region (Harter and Hines 2008). This makes interpretation of the agricultural objective functions more complicated for three crop change scenarios in which alfalfa is converted to grain</w:t>
       </w:r>
-      <w:del w:id="184" w:author="Leland Scantlebury" w:date="2026-05-18T10:26:00Z" w16du:dateUtc="2026-05-18T17:26:00Z">
+      <w:del w:id="187" w:author="Leland Scantlebury" w:date="2026-05-18T10:26:00Z" w16du:dateUtc="2026-05-18T17:26:00Z">
         <w:r>
           <w:delText>; this is explored further in the</w:delText>
         </w:r>
       </w:del>
-      <w:ins w:id="185" w:author="Leland Scantlebury" w:date="2026-05-18T10:26:00Z" w16du:dateUtc="2026-05-18T17:26:00Z">
+      <w:ins w:id="188" w:author="Leland Scantlebury" w:date="2026-05-18T10:26:00Z" w16du:dateUtc="2026-05-18T17:26:00Z">
         <w:r>
           <w:t xml:space="preserve"> (see</w:t>
         </w:r>
@@ -4884,17 +4908,17 @@
       <w:r>
         <w:t xml:space="preserve"> Discussion</w:t>
       </w:r>
-      <w:del w:id="186" w:author="Leland Scantlebury" w:date="2026-05-18T10:26:00Z" w16du:dateUtc="2026-05-18T17:26:00Z">
+      <w:del w:id="189" w:author="Leland Scantlebury" w:date="2026-05-18T10:26:00Z" w16du:dateUtc="2026-05-18T17:26:00Z">
         <w:r>
           <w:delText xml:space="preserve"> </w:delText>
         </w:r>
       </w:del>
-      <w:ins w:id="187" w:author="Leland Scantlebury" w:date="2026-05-18T10:26:00Z" w16du:dateUtc="2026-05-18T17:26:00Z">
+      <w:ins w:id="190" w:author="Leland Scantlebury" w:date="2026-05-18T10:26:00Z" w16du:dateUtc="2026-05-18T17:26:00Z">
         <w:r>
           <w:t>)</w:t>
         </w:r>
       </w:ins>
-      <w:del w:id="188" w:author="Leland Scantlebury" w:date="2026-05-18T10:26:00Z" w16du:dateUtc="2026-05-18T17:26:00Z">
+      <w:del w:id="191" w:author="Leland Scantlebury" w:date="2026-05-18T10:26:00Z" w16du:dateUtc="2026-05-18T17:26:00Z">
         <w:r>
           <w:delText>section</w:delText>
         </w:r>
@@ -4907,8 +4931,8 @@
       <w:pPr>
         <w:pStyle w:val="Heading3"/>
       </w:pPr>
-      <w:bookmarkStart w:id="189" w:name="Xfd5664932b25b1108017cbc6e0e75c8014ecd36"/>
-      <w:bookmarkEnd w:id="182"/>
+      <w:bookmarkStart w:id="192" w:name="Xfd5664932b25b1108017cbc6e0e75c8014ecd36"/>
+      <w:bookmarkEnd w:id="184"/>
       <w:r>
         <w:rPr>
           <w:rStyle w:val="SectionNumber"/>
@@ -5003,7 +5027,7 @@
       <w:r>
         <w:t>This reflects the first-order understanding that, for example, building a reservoir (</w:t>
       </w:r>
-      <w:del w:id="190" w:author="Leland Scantlebury" w:date="2026-05-18T10:27:00Z" w16du:dateUtc="2026-05-18T17:27:00Z">
+      <w:del w:id="193" w:author="Leland Scantlebury" w:date="2026-05-18T10:27:00Z" w16du:dateUtc="2026-05-18T17:27:00Z">
         <w:r>
           <w:delText xml:space="preserve">assigned to </w:delText>
         </w:r>
@@ -5011,7 +5035,7 @@
       <w:r>
         <w:t>category 4) will take more effort and resources in terms of permitting and construction than widespread installation of higher-efficiency irrigation technology (</w:t>
       </w:r>
-      <w:del w:id="191" w:author="Leland Scantlebury" w:date="2026-05-18T10:27:00Z" w16du:dateUtc="2026-05-18T17:27:00Z">
+      <w:del w:id="194" w:author="Leland Scantlebury" w:date="2026-05-18T10:27:00Z" w16du:dateUtc="2026-05-18T17:27:00Z">
         <w:r>
           <w:delText xml:space="preserve">assigned to </w:delText>
         </w:r>
@@ -5019,22 +5043,22 @@
       <w:r>
         <w:t>category 2</w:t>
       </w:r>
-      <w:ins w:id="192" w:author="Leland Scantlebury" w:date="2026-05-18T10:28:00Z" w16du:dateUtc="2026-05-18T17:28:00Z">
+      <w:ins w:id="195" w:author="Leland Scantlebury" w:date="2026-05-18T10:28:00Z" w16du:dateUtc="2026-05-18T17:28:00Z">
         <w:r>
           <w:t xml:space="preserve">) (see </w:t>
         </w:r>
       </w:ins>
-      <w:del w:id="193" w:author="Leland Scantlebury" w:date="2026-05-18T10:28:00Z" w16du:dateUtc="2026-05-18T17:28:00Z">
+      <w:del w:id="196" w:author="Leland Scantlebury" w:date="2026-05-18T10:28:00Z" w16du:dateUtc="2026-05-18T17:28:00Z">
         <w:r>
           <w:delText>)</w:delText>
         </w:r>
       </w:del>
-      <w:del w:id="194" w:author="Leland Scantlebury" w:date="2026-05-18T10:27:00Z" w16du:dateUtc="2026-05-18T17:27:00Z">
+      <w:del w:id="197" w:author="Leland Scantlebury" w:date="2026-05-18T10:27:00Z" w16du:dateUtc="2026-05-18T17:27:00Z">
         <w:r>
           <w:delText>. See</w:delText>
         </w:r>
       </w:del>
-      <w:del w:id="195" w:author="Leland Scantlebury" w:date="2026-05-18T10:28:00Z" w16du:dateUtc="2026-05-18T17:28:00Z">
+      <w:del w:id="198" w:author="Leland Scantlebury" w:date="2026-05-18T10:28:00Z" w16du:dateUtc="2026-05-18T17:28:00Z">
         <w:r>
           <w:delText xml:space="preserve"> </w:delText>
         </w:r>
@@ -5042,12 +5066,12 @@
       <w:r>
         <w:t>Table 6</w:t>
       </w:r>
-      <w:ins w:id="196" w:author="Leland Scantlebury" w:date="2026-05-18T10:27:00Z" w16du:dateUtc="2026-05-18T17:27:00Z">
+      <w:ins w:id="199" w:author="Leland Scantlebury" w:date="2026-05-18T10:27:00Z" w16du:dateUtc="2026-05-18T17:27:00Z">
         <w:r>
           <w:t>)</w:t>
         </w:r>
       </w:ins>
-      <w:del w:id="197" w:author="Leland Scantlebury" w:date="2026-05-18T10:28:00Z" w16du:dateUtc="2026-05-18T17:28:00Z">
+      <w:del w:id="200" w:author="Leland Scantlebury" w:date="2026-05-18T10:28:00Z" w16du:dateUtc="2026-05-18T17:28:00Z">
         <w:r>
           <w:delText xml:space="preserve"> for full list of assigned categories</w:delText>
         </w:r>
@@ -5060,9 +5084,9 @@
       <w:pPr>
         <w:pStyle w:val="Heading2"/>
       </w:pPr>
-      <w:bookmarkStart w:id="198" w:name="analyses-of-objective-function-values"/>
-      <w:bookmarkEnd w:id="139"/>
-      <w:bookmarkEnd w:id="189"/>
+      <w:bookmarkStart w:id="201" w:name="analyses-of-objective-function-values"/>
+      <w:bookmarkEnd w:id="141"/>
+      <w:bookmarkEnd w:id="192"/>
       <w:r>
         <w:rPr>
           <w:rStyle w:val="SectionNumber"/>
@@ -5078,7 +5102,7 @@
       <w:pPr>
         <w:pStyle w:val="Heading3"/>
       </w:pPr>
-      <w:bookmarkStart w:id="199" w:name="trade-off-efficiency"/>
+      <w:bookmarkStart w:id="202" w:name="trade-off-efficiency"/>
       <w:r>
         <w:rPr>
           <w:rStyle w:val="SectionNumber"/>
@@ -5151,22 +5175,22 @@
       <w:r>
         <w:t>)</w:t>
       </w:r>
-      <w:commentRangeStart w:id="200"/>
-      <w:ins w:id="201" w:author="Leland Scantlebury" w:date="2026-05-18T10:29:00Z" w16du:dateUtc="2026-05-18T17:29:00Z">
+      <w:commentRangeStart w:id="203"/>
+      <w:ins w:id="204" w:author="Leland Scantlebury" w:date="2026-05-18T10:29:00Z" w16du:dateUtc="2026-05-18T17:29:00Z">
         <w:r>
           <w:t>:</w:t>
         </w:r>
       </w:ins>
-      <w:commentRangeEnd w:id="200"/>
+      <w:commentRangeEnd w:id="203"/>
       <w:r>
         <w:rPr>
           <w:rStyle w:val="CommentReference"/>
           <w:sz w:val="24"/>
           <w:szCs w:val="24"/>
         </w:rPr>
-        <w:commentReference w:id="200"/>
-      </w:r>
-      <w:del w:id="202" w:author="Leland Scantlebury" w:date="2026-05-18T10:29:00Z" w16du:dateUtc="2026-05-18T17:29:00Z">
+        <w:commentReference w:id="203"/>
+      </w:r>
+      <w:del w:id="205" w:author="Leland Scantlebury" w:date="2026-05-18T10:29:00Z" w16du:dateUtc="2026-05-18T17:29:00Z">
         <w:r>
           <w:delText xml:space="preserve"> (see equations below).</w:delText>
         </w:r>
@@ -6107,8 +6131,8 @@
       <w:pPr>
         <w:pStyle w:val="Heading3"/>
       </w:pPr>
-      <w:bookmarkStart w:id="203" w:name="pareto-optimal-set-of-management-actions"/>
-      <w:bookmarkEnd w:id="199"/>
+      <w:bookmarkStart w:id="206" w:name="pareto-optimal-set-of-management-actions"/>
+      <w:bookmarkEnd w:id="202"/>
       <w:r>
         <w:rPr>
           <w:rStyle w:val="SectionNumber"/>
@@ -6127,18 +6151,18 @@
       <w:r>
         <w:t xml:space="preserve">After calculating the objective function values for each scenario, we applied a simple algorithm to identify the Pareto-optimal set of scenarios (Pareto </w:t>
       </w:r>
-      <w:commentRangeStart w:id="204"/>
+      <w:commentRangeStart w:id="207"/>
       <w:r>
         <w:t>1896</w:t>
       </w:r>
-      <w:commentRangeEnd w:id="204"/>
+      <w:commentRangeEnd w:id="207"/>
       <w:r>
         <w:rPr>
           <w:rStyle w:val="CommentReference"/>
           <w:sz w:val="24"/>
           <w:szCs w:val="24"/>
         </w:rPr>
-        <w:commentReference w:id="204"/>
+        <w:commentReference w:id="207"/>
       </w:r>
       <w:r>
         <w:t xml:space="preserve">). A scenario was identified as Pareto-optimal if there were no other scenarios that performed better in two or more objectives. In other words, the Pareto-optimal set is the collection of scenarios in which it is not possible to improve on one objective without reducing performance in another objective. </w:t>
@@ -6156,9 +6180,9 @@
       <w:pPr>
         <w:pStyle w:val="Heading2"/>
       </w:pPr>
-      <w:bookmarkStart w:id="205" w:name="hydrologic-model-summary"/>
-      <w:bookmarkEnd w:id="198"/>
-      <w:bookmarkEnd w:id="203"/>
+      <w:bookmarkStart w:id="208" w:name="hydrologic-model-summary"/>
+      <w:bookmarkEnd w:id="201"/>
+      <w:bookmarkEnd w:id="206"/>
       <w:r>
         <w:rPr>
           <w:rStyle w:val="SectionNumber"/>
@@ -6174,10 +6198,10 @@
       <w:pPr>
         <w:pStyle w:val="FirstParagraph"/>
         <w:rPr>
-          <w:del w:id="206" w:author="Leland Scantlebury" w:date="2026-05-15T15:54:00Z" w16du:dateUtc="2026-05-15T22:54:00Z"/>
+          <w:del w:id="209" w:author="Leland Scantlebury" w:date="2026-05-15T15:54:00Z" w16du:dateUtc="2026-05-15T22:54:00Z"/>
         </w:rPr>
       </w:pPr>
-      <w:del w:id="207" w:author="Leland Scantlebury" w:date="2026-05-15T15:53:00Z" w16du:dateUtc="2026-05-15T22:53:00Z">
+      <w:del w:id="210" w:author="Leland Scantlebury" w:date="2026-05-15T15:53:00Z" w16du:dateUtc="2026-05-15T22:53:00Z">
         <w:r>
           <w:delText>The Scott Valley Integrated Hydrologic Model (</w:delText>
         </w:r>
@@ -6185,7 +6209,7 @@
       <w:r>
         <w:t>SVIHM</w:t>
       </w:r>
-      <w:del w:id="208" w:author="Leland Scantlebury" w:date="2026-05-15T15:53:00Z" w16du:dateUtc="2026-05-15T22:53:00Z">
+      <w:del w:id="211" w:author="Leland Scantlebury" w:date="2026-05-15T15:53:00Z" w16du:dateUtc="2026-05-15T22:53:00Z">
         <w:r>
           <w:delText>)</w:delText>
         </w:r>
@@ -6193,7 +6217,7 @@
       <w:r>
         <w:t xml:space="preserve"> </w:t>
       </w:r>
-      <w:del w:id="209" w:author="Leland Scantlebury" w:date="2026-05-15T15:53:00Z" w16du:dateUtc="2026-05-15T22:53:00Z">
+      <w:del w:id="212" w:author="Leland Scantlebury" w:date="2026-05-15T15:53:00Z" w16du:dateUtc="2026-05-15T22:53:00Z">
         <w:r>
           <w:delText xml:space="preserve">(2019) </w:delText>
         </w:r>
@@ -6201,7 +6225,7 @@
       <w:r>
         <w:t xml:space="preserve">is a surface and groundwater model </w:t>
       </w:r>
-      <w:del w:id="210" w:author="Leland Scantlebury" w:date="2026-05-15T15:54:00Z" w16du:dateUtc="2026-05-15T22:54:00Z">
+      <w:del w:id="213" w:author="Leland Scantlebury" w:date="2026-05-15T15:54:00Z" w16du:dateUtc="2026-05-15T22:54:00Z">
         <w:r>
           <w:delText>driven by tributary stream inflows, precipitation, and reference evapotranspiration (ET</w:delText>
         </w:r>
@@ -6219,13 +6243,13 @@
     <w:p>
       <w:pPr>
         <w:pStyle w:val="FirstParagraph"/>
-        <w:pPrChange w:id="211" w:author="Leland Scantlebury" w:date="2026-05-15T15:54:00Z" w16du:dateUtc="2026-05-15T22:54:00Z">
+        <w:pPrChange w:id="214" w:author="Leland Scantlebury" w:date="2026-05-15T15:54:00Z" w16du:dateUtc="2026-05-15T22:54:00Z">
           <w:pPr>
             <w:pStyle w:val="BodyText"/>
           </w:pPr>
         </w:pPrChange>
       </w:pPr>
-      <w:del w:id="212" w:author="Leland Scantlebury" w:date="2026-05-15T15:54:00Z" w16du:dateUtc="2026-05-15T22:54:00Z">
+      <w:del w:id="215" w:author="Leland Scantlebury" w:date="2026-05-15T15:54:00Z" w16du:dateUtc="2026-05-15T22:54:00Z">
         <w:r>
           <w:delText xml:space="preserve">The </w:delText>
         </w:r>
@@ -6236,7 +6260,7 @@
       <w:r>
         <w:t xml:space="preserve">composed of three cascading sub-models. First, complete daily records of tributary stream inflow are generated using a </w:t>
       </w:r>
-      <w:del w:id="213" w:author="Leland Scantlebury" w:date="2026-05-15T15:53:00Z" w16du:dateUtc="2026-05-15T22:53:00Z">
+      <w:del w:id="216" w:author="Leland Scantlebury" w:date="2026-05-15T15:53:00Z" w16du:dateUtc="2026-05-15T22:53:00Z">
         <w:r>
           <w:delText xml:space="preserve">statistical </w:delText>
         </w:r>
@@ -6244,7 +6268,7 @@
       <w:r>
         <w:t xml:space="preserve">streamflow regression model, in which the continuous Fort Jones record was used to predict missing values in the daily flow records of 12 major tributaries (Foglia et al. 2013). Second, a custom-built soil water budget model simulated irrigation demand, irrigation applied (surface and groundwater), ET and percolation to aquifer calculated on a field-by-field, daily time step basis. This model simulates </w:t>
       </w:r>
-      <w:del w:id="214" w:author="Leland Scantlebury" w:date="2026-05-15T15:55:00Z" w16du:dateUtc="2026-05-15T22:55:00Z">
+      <w:del w:id="217" w:author="Leland Scantlebury" w:date="2026-05-15T15:55:00Z" w16du:dateUtc="2026-05-15T22:55:00Z">
         <w:r>
           <w:delText xml:space="preserve">individual </w:delText>
         </w:r>
@@ -6309,8 +6333,8 @@
       <w:pPr>
         <w:pStyle w:val="Heading2"/>
       </w:pPr>
-      <w:bookmarkStart w:id="215" w:name="management-scenario-descriptions"/>
-      <w:bookmarkEnd w:id="205"/>
+      <w:bookmarkStart w:id="218" w:name="management-scenario-descriptions"/>
+      <w:bookmarkEnd w:id="208"/>
       <w:r>
         <w:rPr>
           <w:rStyle w:val="SectionNumber"/>
@@ -6329,7 +6353,7 @@
       <w:r>
         <w:t xml:space="preserve">For the Scott Valley GSP, SVIHM was used to simulate 64 management action scenarios; in most other California GSPs, between one and five scenarios was more common (e.g., FCGMA 2019; YSGA 2022). </w:t>
       </w:r>
-      <w:del w:id="216" w:author="Leland Scantlebury" w:date="2026-05-15T15:57:00Z" w16du:dateUtc="2026-05-15T22:57:00Z">
+      <w:del w:id="219" w:author="Leland Scantlebury" w:date="2026-05-15T15:57:00Z" w16du:dateUtc="2026-05-15T22:57:00Z">
         <w:r>
           <w:delText xml:space="preserve">This high number of scenarios was possible because the SVIHM had been under development for 8 years prior to the start of GSP work (e.g., Foglia et al. 2013; Tolley, Foglia, and Harter 2019), and cost-effective technical support was provided by graduate students and researchers at the University of California, Davis. </w:delText>
         </w:r>
@@ -6353,7 +6377,7 @@
       <w:r>
         <w:t xml:space="preserve">The scenarios are grouped here by category (Table 4). Within each category various details were altered (e.g., an alfalfa irrigation cessation date of July 10 versus August 15). Additional scenario descriptions are included </w:t>
       </w:r>
-      <w:del w:id="217" w:author="Leland Scantlebury" w:date="2026-05-18T10:47:00Z" w16du:dateUtc="2026-05-18T17:47:00Z">
+      <w:del w:id="220" w:author="Leland Scantlebury" w:date="2026-05-18T10:47:00Z" w16du:dateUtc="2026-05-18T17:47:00Z">
         <w:r>
           <w:delText xml:space="preserve">below </w:delText>
         </w:r>
@@ -6361,12 +6385,12 @@
       <w:r>
         <w:t xml:space="preserve">in </w:t>
       </w:r>
-      <w:del w:id="218" w:author="Leland Scantlebury" w:date="2026-05-18T10:47:00Z" w16du:dateUtc="2026-05-18T17:47:00Z">
+      <w:del w:id="221" w:author="Leland Scantlebury" w:date="2026-05-18T10:47:00Z" w16du:dateUtc="2026-05-18T17:47:00Z">
         <w:r>
           <w:delText xml:space="preserve">Results </w:delText>
         </w:r>
       </w:del>
-      <w:ins w:id="219" w:author="Leland Scantlebury" w:date="2026-05-18T10:47:00Z" w16du:dateUtc="2026-05-18T17:47:00Z">
+      <w:ins w:id="222" w:author="Leland Scantlebury" w:date="2026-05-18T10:47:00Z" w16du:dateUtc="2026-05-18T17:47:00Z">
         <w:r>
           <w:t xml:space="preserve">Table 6 </w:t>
         </w:r>
@@ -6374,7 +6398,7 @@
       <w:r>
         <w:t>and</w:t>
       </w:r>
-      <w:ins w:id="220" w:author="Leland Scantlebury" w:date="2026-05-18T10:47:00Z" w16du:dateUtc="2026-05-18T17:47:00Z">
+      <w:ins w:id="223" w:author="Leland Scantlebury" w:date="2026-05-18T10:47:00Z" w16du:dateUtc="2026-05-18T17:47:00Z">
         <w:r>
           <w:t xml:space="preserve"> related figures</w:t>
         </w:r>
@@ -6387,8 +6411,8 @@
       <w:pPr>
         <w:pStyle w:val="TableCaption"/>
       </w:pPr>
-      <w:bookmarkStart w:id="221" w:name="tab:scenCategoryTab"/>
-      <w:bookmarkEnd w:id="221"/>
+      <w:bookmarkStart w:id="224" w:name="tab:scenCategoryTab"/>
+      <w:bookmarkEnd w:id="224"/>
       <w:r>
         <w:t>Table 4: Management scenario categories (abbreviated), a general description, the number of scenarios in each category, the feasibility proxy and the type of management action.</w:t>
       </w:r>
@@ -8733,9 +8757,9 @@
       <w:pPr>
         <w:pStyle w:val="Heading1"/>
       </w:pPr>
-      <w:bookmarkStart w:id="222" w:name="results"/>
-      <w:bookmarkEnd w:id="119"/>
-      <w:bookmarkEnd w:id="215"/>
+      <w:bookmarkStart w:id="225" w:name="results"/>
+      <w:bookmarkEnd w:id="120"/>
+      <w:bookmarkEnd w:id="218"/>
       <w:r>
         <w:rPr>
           <w:rStyle w:val="SectionNumber"/>
@@ -8762,18 +8786,26 @@
       <w:r>
         <w:t xml:space="preserve"> and 24 scenarios achieved local management goals was summarized using two objective functions. A summary value for the agricultural objective (total crop ET volume) and for the environmental objective (a Hydrologic Benefit [HB] value in units of predicted smolt abundance for coho) were calculated for each water year/brood year in the 35-year simulation period, for each scenario (</w:t>
       </w:r>
-      <w:commentRangeStart w:id="223"/>
+      <w:commentRangeStart w:id="226"/>
+      <w:commentRangeStart w:id="227"/>
       <w:r>
         <w:t xml:space="preserve">Table 6). </w:t>
       </w:r>
-      <w:commentRangeEnd w:id="223"/>
+      <w:commentRangeEnd w:id="226"/>
       <w:r>
         <w:rPr>
           <w:rStyle w:val="CommentReference"/>
           <w:sz w:val="24"/>
           <w:szCs w:val="24"/>
         </w:rPr>
-        <w:commentReference w:id="223"/>
+        <w:commentReference w:id="226"/>
+      </w:r>
+      <w:commentRangeEnd w:id="227"/>
+      <w:r>
+        <w:rPr>
+          <w:rStyle w:val="CommentReference"/>
+        </w:rPr>
+        <w:commentReference w:id="227"/>
       </w:r>
       <w:r>
         <w:t>(See Supplemental Material for HB function results in different units; Table 5.) In addition to the two objective functions, each scenario has been assigned an infrastructure feasibility category (Tables 4 and 6).</w:t>
@@ -8783,8 +8815,8 @@
       <w:pPr>
         <w:pStyle w:val="TableCaption"/>
       </w:pPr>
-      <w:bookmarkStart w:id="224" w:name="tab:HBUnitsLocationTab"/>
-      <w:bookmarkEnd w:id="224"/>
+      <w:bookmarkStart w:id="228" w:name="tab:HBUnitsLocationTab"/>
+      <w:bookmarkEnd w:id="228"/>
       <w:r>
         <w:t>Table 5: Units of Hydrologic Benefit (HB) function and location in document.</w:t>
       </w:r>
@@ -9226,7 +9258,7 @@
       <w:pPr>
         <w:pStyle w:val="Heading2"/>
       </w:pPr>
-      <w:bookmarkStart w:id="225" w:name="X7284884376ee93470eb63c20106f06dfdc86233"/>
+      <w:bookmarkStart w:id="229" w:name="X7284884376ee93470eb63c20106f06dfdc86233"/>
       <w:r>
         <w:rPr>
           <w:rStyle w:val="SectionNumber"/>
@@ -9295,8 +9327,8 @@
       <w:pPr>
         <w:pStyle w:val="Heading2"/>
       </w:pPr>
-      <w:bookmarkStart w:id="226" w:name="objective-function-results-over-time"/>
-      <w:bookmarkEnd w:id="225"/>
+      <w:bookmarkStart w:id="230" w:name="objective-function-results-over-time"/>
+      <w:bookmarkEnd w:id="229"/>
       <w:r>
         <w:rPr>
           <w:rStyle w:val="SectionNumber"/>
@@ -9380,12 +9412,12 @@
       <w:pPr>
         <w:pStyle w:val="ImageCaption"/>
       </w:pPr>
-      <w:bookmarkStart w:id="227" w:name="fig:benefitByWYMainText"/>
-      <w:bookmarkEnd w:id="227"/>
+      <w:bookmarkStart w:id="231" w:name="fig:benefitByWYMainText"/>
+      <w:bookmarkEnd w:id="231"/>
       <w:r>
         <w:t xml:space="preserve">Figure 5:  Comparison of annual performance in two objective functions (Hydrologic Benefit and ET, representing environmental and agricultural objectives, respectively) for brood years 1991-2025. </w:t>
       </w:r>
-      <w:commentRangeStart w:id="228"/>
+      <w:commentRangeStart w:id="232"/>
       <w:r>
         <w:t xml:space="preserve">The scenarios pictured are </w:t>
       </w:r>
@@ -9397,30 +9429,30 @@
       <w:r>
         <w:t xml:space="preserve"> (black circles) and a scenario from </w:t>
       </w:r>
-      <w:commentRangeStart w:id="229"/>
+      <w:commentRangeStart w:id="233"/>
       <w:r>
         <w:t>each of three categories</w:t>
       </w:r>
-      <w:commentRangeEnd w:id="229"/>
+      <w:commentRangeEnd w:id="233"/>
       <w:r>
         <w:rPr>
           <w:rStyle w:val="CommentReference"/>
           <w:sz w:val="24"/>
           <w:szCs w:val="24"/>
         </w:rPr>
-        <w:commentReference w:id="229"/>
+        <w:commentReference w:id="233"/>
       </w:r>
       <w:r>
         <w:t>: Enhanced Recharge, Crop Change, and eight thousand acres of irrigated crops converted to low-ET Native Vegetation. Dry-type water years (vertical bars) are 1991, ’92, ’94, 2001, ’09, ’13, ’14, ’18, and ’20-’22.</w:t>
       </w:r>
-      <w:commentRangeEnd w:id="228"/>
+      <w:commentRangeEnd w:id="232"/>
       <w:r>
         <w:rPr>
           <w:rStyle w:val="CommentReference"/>
           <w:sz w:val="24"/>
           <w:szCs w:val="24"/>
         </w:rPr>
-        <w:commentReference w:id="228"/>
+        <w:commentReference w:id="232"/>
       </w:r>
       <w:r>
         <w:t xml:space="preserve"> Shown also in Supplement B.</w:t>
@@ -9449,12 +9481,12 @@
       <w:r>
         <w:t xml:space="preserve"> scenario, it seems that when the HB function predicts a particularly good year for smolt production (i.e., &gt; 20,000 coho smolt-equiv.), it is driven by a large magnitude fall flow difference, or fall pulse</w:t>
       </w:r>
-      <w:ins w:id="230" w:author="Leland Scantlebury" w:date="2026-05-15T16:10:00Z" w16du:dateUtc="2026-05-15T23:10:00Z">
+      <w:ins w:id="234" w:author="Leland Scantlebury" w:date="2026-05-15T16:10:00Z" w16du:dateUtc="2026-05-15T23:10:00Z">
         <w:r>
           <w:t xml:space="preserve">, </w:t>
         </w:r>
       </w:ins>
-      <w:ins w:id="231" w:author="Leland Scantlebury" w:date="2026-05-15T16:11:00Z" w16du:dateUtc="2026-05-15T23:11:00Z">
+      <w:ins w:id="235" w:author="Leland Scantlebury" w:date="2026-05-15T16:11:00Z" w16du:dateUtc="2026-05-15T23:11:00Z">
         <w:r>
           <w:t>driven by heavy precipitation</w:t>
         </w:r>
@@ -9500,8 +9532,8 @@
       <w:pPr>
         <w:pStyle w:val="Heading2"/>
       </w:pPr>
-      <w:bookmarkStart w:id="232" w:name="X6ea044f980d869f5a7cc19c230170d0b17278b6"/>
-      <w:bookmarkEnd w:id="226"/>
+      <w:bookmarkStart w:id="236" w:name="X6ea044f980d869f5a7cc19c230170d0b17278b6"/>
+      <w:bookmarkEnd w:id="230"/>
       <w:r>
         <w:rPr>
           <w:rStyle w:val="SectionNumber"/>
@@ -9577,8 +9609,8 @@
       <w:pPr>
         <w:pStyle w:val="ImageCaption"/>
       </w:pPr>
-      <w:bookmarkStart w:id="233" w:name="fig:farmerFishTradeoffFigureMainText"/>
-      <w:bookmarkEnd w:id="233"/>
+      <w:bookmarkStart w:id="237" w:name="fig:farmerFishTradeoffFigureMainText"/>
+      <w:bookmarkEnd w:id="237"/>
       <w:r>
         <w:t xml:space="preserve">Figure 6:  Environmental and agricultural objective function performance (in terms of Hydrologic Benefit, or HB, value; and crop ET volume) for </w:t>
       </w:r>
@@ -9590,12 +9622,12 @@
       <w:r>
         <w:t xml:space="preserve"> (black circle in upper left) and 25 management scenarios. Symbol x and y coordinates are the average of 35 annual HB and ET values for each scenario over the full model period (water years 1991-2025); for </w:t>
       </w:r>
-      <w:del w:id="234" w:author="Leland Scantlebury" w:date="2026-05-15T16:01:00Z" w16du:dateUtc="2026-05-15T23:01:00Z">
+      <w:del w:id="238" w:author="Leland Scantlebury" w:date="2026-05-15T16:01:00Z" w16du:dateUtc="2026-05-15T23:01:00Z">
         <w:r>
           <w:delText>exampe</w:delText>
         </w:r>
       </w:del>
-      <w:ins w:id="235" w:author="Leland Scantlebury" w:date="2026-05-15T16:01:00Z" w16du:dateUtc="2026-05-15T23:01:00Z">
+      <w:ins w:id="239" w:author="Leland Scantlebury" w:date="2026-05-15T16:01:00Z" w16du:dateUtc="2026-05-15T23:01:00Z">
         <w:r>
           <w:t>example</w:t>
         </w:r>
@@ -9613,8 +9645,8 @@
       <w:pPr>
         <w:pStyle w:val="TableCaption"/>
       </w:pPr>
-      <w:bookmarkStart w:id="236" w:name="tab:scenarioResultsTabMainText"/>
-      <w:bookmarkEnd w:id="236"/>
+      <w:bookmarkStart w:id="240" w:name="tab:scenarioResultsTabMainText"/>
+      <w:bookmarkEnd w:id="240"/>
       <w:r>
         <w:lastRenderedPageBreak/>
         <w:t>Table 6: Scenario attributes for 25 scenarios. Values in the Mean Hydrologic Benefit (HB) and Mean ET columns are averages of 35 annual values for each scenario. Efficiency not calculated for scenarios with no average ET loss.</w:t>
@@ -17197,7 +17229,7 @@
         <w:lastRenderedPageBreak/>
         <w:t xml:space="preserve">In units of coho smolt abundance, three management scenarios </w:t>
       </w:r>
-      <w:del w:id="237" w:author="Leland Scantlebury" w:date="2026-05-15T16:02:00Z" w16du:dateUtc="2026-05-15T23:02:00Z">
+      <w:del w:id="241" w:author="Leland Scantlebury" w:date="2026-05-15T16:02:00Z" w16du:dateUtc="2026-05-15T23:02:00Z">
         <w:r>
           <w:delText xml:space="preserve">actually </w:delText>
         </w:r>
@@ -17221,12 +17253,12 @@
       <w:r>
         <w:t xml:space="preserve"> scenarios produce more favorable flows for smolt production (Figure 6). This is </w:t>
       </w:r>
-      <w:del w:id="238" w:author="Leland Scantlebury" w:date="2026-05-15T16:02:00Z" w16du:dateUtc="2026-05-15T23:02:00Z">
+      <w:del w:id="242" w:author="Leland Scantlebury" w:date="2026-05-15T16:02:00Z" w16du:dateUtc="2026-05-15T23:02:00Z">
         <w:r>
           <w:delText>larguly</w:delText>
         </w:r>
       </w:del>
-      <w:ins w:id="239" w:author="Leland Scantlebury" w:date="2026-05-15T16:02:00Z" w16du:dateUtc="2026-05-15T23:02:00Z">
+      <w:ins w:id="243" w:author="Leland Scantlebury" w:date="2026-05-15T16:02:00Z" w16du:dateUtc="2026-05-15T23:02:00Z">
         <w:r>
           <w:t>largely</w:t>
         </w:r>
@@ -17234,7 +17266,7 @@
       <w:r>
         <w:t xml:space="preserve"> due to </w:t>
       </w:r>
-      <w:del w:id="240" w:author="Leland Scantlebury" w:date="2026-05-18T10:54:00Z" w16du:dateUtc="2026-05-18T17:54:00Z">
+      <w:del w:id="244" w:author="Leland Scantlebury" w:date="2026-05-18T10:54:00Z" w16du:dateUtc="2026-05-18T17:54:00Z">
         <w:r>
           <w:delText xml:space="preserve">scenario </w:delText>
         </w:r>
@@ -17242,12 +17274,12 @@
       <w:r>
         <w:t xml:space="preserve">impacts on the largest single component of the HB function for coho smolt abundance, first fall flow difference </w:t>
       </w:r>
-      <w:del w:id="241" w:author="Leland Scantlebury" w:date="2026-05-18T10:54:00Z" w16du:dateUtc="2026-05-18T17:54:00Z">
+      <w:del w:id="245" w:author="Leland Scantlebury" w:date="2026-05-18T10:54:00Z" w16du:dateUtc="2026-05-18T17:54:00Z">
         <w:r>
           <w:delText xml:space="preserve">or </w:delText>
         </w:r>
       </w:del>
-      <w:ins w:id="242" w:author="Leland Scantlebury" w:date="2026-05-18T10:54:00Z" w16du:dateUtc="2026-05-18T17:54:00Z">
+      <w:ins w:id="246" w:author="Leland Scantlebury" w:date="2026-05-18T10:54:00Z" w16du:dateUtc="2026-05-18T17:54:00Z">
         <w:r>
           <w:t>(</w:t>
         </w:r>
@@ -17258,7 +17290,7 @@
         </w:rPr>
         <w:t>f1_FA_Dif_num</w:t>
       </w:r>
-      <w:ins w:id="243" w:author="Leland Scantlebury" w:date="2026-05-18T10:54:00Z" w16du:dateUtc="2026-05-18T17:54:00Z">
+      <w:ins w:id="247" w:author="Leland Scantlebury" w:date="2026-05-18T10:54:00Z" w16du:dateUtc="2026-05-18T17:54:00Z">
         <w:r>
           <w:rPr>
             <w:rStyle w:val="VerbatimChar"/>
@@ -17269,12 +17301,12 @@
       <w:r>
         <w:t xml:space="preserve">. This metric is calculated as the difference between dry season median discharge and peak fall pulse discharge; in years with no detectable fall pulse flow, this value is set to </w:t>
       </w:r>
-      <w:del w:id="244" w:author="Leland Scantlebury" w:date="2026-05-15T16:02:00Z" w16du:dateUtc="2026-05-15T23:02:00Z">
+      <w:del w:id="248" w:author="Leland Scantlebury" w:date="2026-05-15T16:02:00Z" w16du:dateUtc="2026-05-15T23:02:00Z">
         <w:r>
           <w:delText xml:space="preserve">0 </w:delText>
         </w:r>
       </w:del>
-      <w:ins w:id="245" w:author="Leland Scantlebury" w:date="2026-05-15T16:02:00Z" w16du:dateUtc="2026-05-15T23:02:00Z">
+      <w:ins w:id="249" w:author="Leland Scantlebury" w:date="2026-05-15T16:02:00Z" w16du:dateUtc="2026-05-15T23:02:00Z">
         <w:r>
           <w:t xml:space="preserve">zero </w:t>
         </w:r>
@@ -17287,7 +17319,7 @@
       <w:pPr>
         <w:pStyle w:val="Heading3"/>
       </w:pPr>
-      <w:bookmarkStart w:id="246" w:name="small-reservoir"/>
+      <w:bookmarkStart w:id="250" w:name="small-reservoir"/>
       <w:r>
         <w:rPr>
           <w:rStyle w:val="SectionNumber"/>
@@ -17303,7 +17335,8 @@
       <w:pPr>
         <w:pStyle w:val="FirstParagraph"/>
       </w:pPr>
-      <w:commentRangeStart w:id="247"/>
+      <w:commentRangeStart w:id="251"/>
+      <w:commentRangeStart w:id="252"/>
       <w:r>
         <w:t>Reservoir scenarios simulate how flows would change if a small reservoir (9 thousand acre-feet, or 11.1 10</w:t>
       </w:r>
@@ -17325,14 +17358,21 @@
       <w:r>
         <w:t>, approximately 9% of mean annual irrigation), located in the headwaters on one of 3 tributaries, were operated with the following objectives: retain winter flow until full (Dec-Mar), pass along growing season flow (Apr-Aug), and supplement dry season flow (Sep-Nov).</w:t>
       </w:r>
-      <w:commentRangeEnd w:id="247"/>
+      <w:commentRangeEnd w:id="251"/>
       <w:r>
         <w:rPr>
           <w:rStyle w:val="CommentReference"/>
           <w:sz w:val="24"/>
           <w:szCs w:val="24"/>
         </w:rPr>
-        <w:commentReference w:id="247"/>
+        <w:commentReference w:id="251"/>
+      </w:r>
+      <w:commentRangeEnd w:id="252"/>
+      <w:r>
+        <w:rPr>
+          <w:rStyle w:val="CommentReference"/>
+        </w:rPr>
+        <w:commentReference w:id="252"/>
       </w:r>
     </w:p>
     <w:p>
@@ -17342,7 +17382,7 @@
       <w:r>
         <w:t>Somewhat contrary to expectations, reservoir scenarios provide limited benefit to coho populations</w:t>
       </w:r>
-      <w:del w:id="248" w:author="Leland Scantlebury" w:date="2026-05-18T14:21:00Z" w16du:dateUtc="2026-05-18T21:21:00Z">
+      <w:del w:id="253" w:author="Leland Scantlebury" w:date="2026-05-18T14:21:00Z" w16du:dateUtc="2026-05-18T21:21:00Z">
         <w:r>
           <w:delText>,</w:delText>
         </w:r>
@@ -17350,26 +17390,34 @@
       <w:r>
         <w:t xml:space="preserve"> relative to other management options: small reservoirs may not have capacity to add fall flow during dry years when baseflows are lowest (Figure 6, green squares, and Supplements B and C, Figure 3). </w:t>
       </w:r>
-      <w:commentRangeStart w:id="249"/>
+      <w:commentRangeStart w:id="254"/>
+      <w:commentRangeStart w:id="255"/>
       <w:r>
         <w:t>Reservoir scenarios seem to support Chinook populations significantly more than coho: even a small reservoir on one tributary appears to dampen wet season stormflows enough to benefit Chinook (Supplements D and E, Figure 3).</w:t>
       </w:r>
-      <w:commentRangeEnd w:id="249"/>
+      <w:commentRangeEnd w:id="254"/>
       <w:r>
         <w:rPr>
           <w:rStyle w:val="CommentReference"/>
           <w:sz w:val="24"/>
           <w:szCs w:val="24"/>
         </w:rPr>
-        <w:commentReference w:id="249"/>
+        <w:commentReference w:id="254"/>
+      </w:r>
+      <w:commentRangeEnd w:id="255"/>
+      <w:r>
+        <w:rPr>
+          <w:rStyle w:val="CommentReference"/>
+        </w:rPr>
+        <w:commentReference w:id="255"/>
       </w:r>
     </w:p>
     <w:p>
       <w:pPr>
         <w:pStyle w:val="Heading3"/>
       </w:pPr>
-      <w:bookmarkStart w:id="250" w:name="X2217a73426969aa3255f137f1c1e7245c2e41e0"/>
-      <w:bookmarkEnd w:id="246"/>
+      <w:bookmarkStart w:id="256" w:name="X2217a73426969aa3255f137f1c1e7245c2e41e0"/>
+      <w:bookmarkEnd w:id="250"/>
       <w:r>
         <w:rPr>
           <w:rStyle w:val="SectionNumber"/>
@@ -17479,8 +17527,8 @@
       <w:pPr>
         <w:pStyle w:val="Heading3"/>
       </w:pPr>
-      <w:bookmarkStart w:id="251" w:name="irrigation-curtailment-alfalfa-all-crops"/>
-      <w:bookmarkEnd w:id="250"/>
+      <w:bookmarkStart w:id="257" w:name="irrigation-curtailment-alfalfa-all-crops"/>
+      <w:bookmarkEnd w:id="256"/>
       <w:r>
         <w:rPr>
           <w:rStyle w:val="SectionNumber"/>
@@ -17499,7 +17547,7 @@
       <w:r>
         <w:t xml:space="preserve">Early cessation of irrigation on alfalfa fields effectively means </w:t>
       </w:r>
-      <w:del w:id="252" w:author="Leland Scantlebury" w:date="2026-05-18T14:23:00Z" w16du:dateUtc="2026-05-18T21:23:00Z">
+      <w:del w:id="258" w:author="Leland Scantlebury" w:date="2026-05-18T14:23:00Z" w16du:dateUtc="2026-05-18T21:23:00Z">
         <w:r>
           <w:delText xml:space="preserve">that </w:delText>
         </w:r>
@@ -17507,7 +17555,7 @@
       <w:r>
         <w:t>growers forgo the harvest of one or more hay cuttings, which can be a significant economic impact for</w:t>
       </w:r>
-      <w:del w:id="253" w:author="Leland Scantlebury" w:date="2026-05-18T14:24:00Z" w16du:dateUtc="2026-05-18T21:24:00Z">
+      <w:del w:id="259" w:author="Leland Scantlebury" w:date="2026-05-18T14:24:00Z" w16du:dateUtc="2026-05-18T21:24:00Z">
         <w:r>
           <w:delText xml:space="preserve"> a</w:delText>
         </w:r>
@@ -17515,7 +17563,7 @@
       <w:r>
         <w:t xml:space="preserve"> farm</w:t>
       </w:r>
-      <w:ins w:id="254" w:author="Leland Scantlebury" w:date="2026-05-18T14:24:00Z" w16du:dateUtc="2026-05-18T21:24:00Z">
+      <w:ins w:id="260" w:author="Leland Scantlebury" w:date="2026-05-18T14:24:00Z" w16du:dateUtc="2026-05-18T21:24:00Z">
         <w:r>
           <w:t>s</w:t>
         </w:r>
@@ -17553,8 +17601,8 @@
       <w:pPr>
         <w:pStyle w:val="Heading3"/>
       </w:pPr>
-      <w:bookmarkStart w:id="255" w:name="crop-change"/>
-      <w:bookmarkEnd w:id="251"/>
+      <w:bookmarkStart w:id="261" w:name="crop-change"/>
+      <w:bookmarkEnd w:id="257"/>
       <w:r>
         <w:rPr>
           <w:rStyle w:val="SectionNumber"/>
@@ -17594,8 +17642,8 @@
       <w:pPr>
         <w:pStyle w:val="Heading3"/>
       </w:pPr>
-      <w:bookmarkStart w:id="256" w:name="low-flow-diversion-limits"/>
-      <w:bookmarkEnd w:id="255"/>
+      <w:bookmarkStart w:id="262" w:name="low-flow-diversion-limits"/>
+      <w:bookmarkEnd w:id="261"/>
       <w:r>
         <w:rPr>
           <w:rStyle w:val="SectionNumber"/>
@@ -17636,8 +17684,8 @@
       <w:pPr>
         <w:pStyle w:val="Heading3"/>
       </w:pPr>
-      <w:bookmarkStart w:id="257" w:name="native-vegetation"/>
-      <w:bookmarkEnd w:id="256"/>
+      <w:bookmarkStart w:id="263" w:name="native-vegetation"/>
+      <w:bookmarkEnd w:id="262"/>
       <w:r>
         <w:rPr>
           <w:rStyle w:val="SectionNumber"/>
@@ -17757,9 +17805,9 @@
       <w:pPr>
         <w:pStyle w:val="Heading2"/>
       </w:pPr>
-      <w:bookmarkStart w:id="258" w:name="X452f0639db2ebbe2cd3177f14e96530f2d1a15a"/>
-      <w:bookmarkEnd w:id="232"/>
-      <w:bookmarkEnd w:id="257"/>
+      <w:bookmarkStart w:id="264" w:name="X452f0639db2ebbe2cd3177f14e96530f2d1a15a"/>
+      <w:bookmarkEnd w:id="236"/>
+      <w:bookmarkEnd w:id="263"/>
       <w:r>
         <w:rPr>
           <w:rStyle w:val="SectionNumber"/>
@@ -17930,12 +17978,13 @@
       <w:pPr>
         <w:pStyle w:val="ImageCaption"/>
       </w:pPr>
-      <w:bookmarkStart w:id="259" w:name="fig:farmerFishInfraFigure3D"/>
-      <w:bookmarkEnd w:id="259"/>
+      <w:bookmarkStart w:id="265" w:name="fig:farmerFishInfraFigure3D"/>
+      <w:bookmarkEnd w:id="265"/>
       <w:r>
         <w:t xml:space="preserve">Figure 7:  </w:t>
       </w:r>
-      <w:commentRangeStart w:id="260"/>
+      <w:commentRangeStart w:id="266"/>
+      <w:commentRangeStart w:id="267"/>
       <w:r>
         <w:t xml:space="preserve">A three-dimensional scatter plot of the objective function values for </w:t>
       </w:r>
@@ -17947,30 +17996,47 @@
       <w:r>
         <w:t xml:space="preserve"> and 24 management scenarios, averaged over 35 water years (1991-2025). </w:t>
       </w:r>
-      <w:commentRangeEnd w:id="260"/>
+      <w:commentRangeEnd w:id="266"/>
       <w:r>
         <w:rPr>
           <w:rStyle w:val="CommentReference"/>
           <w:sz w:val="24"/>
           <w:szCs w:val="24"/>
         </w:rPr>
-        <w:commentReference w:id="260"/>
+        <w:commentReference w:id="266"/>
+      </w:r>
+      <w:commentRangeEnd w:id="267"/>
+      <w:r>
+        <w:rPr>
+          <w:rStyle w:val="CommentReference"/>
+          <w:i w:val="0"/>
+        </w:rPr>
+        <w:commentReference w:id="267"/>
       </w:r>
       <w:r>
         <w:t xml:space="preserve">Larger spheres are shown for the Pareto-optimal set of scenarios. </w:t>
       </w:r>
-      <w:commentRangeStart w:id="261"/>
+      <w:commentRangeStart w:id="268"/>
+      <w:commentRangeStart w:id="269"/>
       <w:r>
         <w:t>Scenario colors correspond to legend in Figure 6.</w:t>
       </w:r>
-      <w:commentRangeEnd w:id="261"/>
+      <w:commentRangeEnd w:id="268"/>
       <w:r>
         <w:rPr>
           <w:rStyle w:val="CommentReference"/>
           <w:sz w:val="24"/>
           <w:szCs w:val="24"/>
         </w:rPr>
-        <w:commentReference w:id="261"/>
+        <w:commentReference w:id="268"/>
+      </w:r>
+      <w:commentRangeEnd w:id="269"/>
+      <w:r>
+        <w:rPr>
+          <w:rStyle w:val="CommentReference"/>
+          <w:i w:val="0"/>
+        </w:rPr>
+        <w:commentReference w:id="269"/>
       </w:r>
       <w:r>
         <w:t xml:space="preserve"> The corner corresponding to optimal values of all objective functions (the ‘best’ corner) is highlighted with a red arrow.</w:t>
@@ -18021,8 +18087,8 @@
       <w:pPr>
         <w:pStyle w:val="Heading2"/>
       </w:pPr>
-      <w:bookmarkStart w:id="262" w:name="comparison-to-gsp-priorities"/>
-      <w:bookmarkEnd w:id="258"/>
+      <w:bookmarkStart w:id="270" w:name="comparison-to-gsp-priorities"/>
+      <w:bookmarkEnd w:id="264"/>
       <w:r>
         <w:rPr>
           <w:rStyle w:val="SectionNumber"/>
@@ -18032,18 +18098,28 @@
       <w:r>
         <w:tab/>
       </w:r>
-      <w:commentRangeStart w:id="263"/>
+      <w:commentRangeStart w:id="271"/>
+      <w:commentRangeStart w:id="272"/>
       <w:r>
         <w:t>Comparison to GSP Priorities</w:t>
       </w:r>
-      <w:commentRangeEnd w:id="263"/>
+      <w:commentRangeEnd w:id="271"/>
       <w:r>
         <w:rPr>
           <w:rStyle w:val="CommentReference"/>
           <w:sz w:val="32"/>
           <w:szCs w:val="32"/>
         </w:rPr>
-        <w:commentReference w:id="263"/>
+        <w:commentReference w:id="271"/>
+      </w:r>
+      <w:commentRangeEnd w:id="272"/>
+      <w:r>
+        <w:rPr>
+          <w:rStyle w:val="CommentReference"/>
+          <w:rFonts w:asciiTheme="minorHAnsi" w:eastAsiaTheme="minorHAnsi" w:hAnsiTheme="minorHAnsi" w:cstheme="minorBidi"/>
+          <w:color w:val="auto"/>
+        </w:rPr>
+        <w:commentReference w:id="272"/>
       </w:r>
     </w:p>
     <w:p>
@@ -18126,8 +18202,8 @@
       <w:pPr>
         <w:pStyle w:val="TableCaption"/>
       </w:pPr>
-      <w:bookmarkStart w:id="264" w:name="tab:gspMgmtList"/>
-      <w:bookmarkEnd w:id="264"/>
+      <w:bookmarkStart w:id="273" w:name="tab:gspMgmtList"/>
+      <w:bookmarkEnd w:id="273"/>
       <w:r>
         <w:t xml:space="preserve">Table 7: List of management actions in Chapter 4 of the GSP and analogues in the set of 25 simulated scenarios. The Tier </w:t>
       </w:r>
@@ -21184,9 +21260,9 @@
       <w:pPr>
         <w:pStyle w:val="Heading1"/>
       </w:pPr>
-      <w:bookmarkStart w:id="265" w:name="discussion"/>
-      <w:bookmarkEnd w:id="222"/>
-      <w:bookmarkEnd w:id="262"/>
+      <w:bookmarkStart w:id="274" w:name="discussion"/>
+      <w:bookmarkEnd w:id="225"/>
+      <w:bookmarkEnd w:id="270"/>
       <w:r>
         <w:rPr>
           <w:rStyle w:val="SectionNumber"/>
@@ -21203,7 +21279,7 @@
       <w:pPr>
         <w:pStyle w:val="Heading2"/>
       </w:pPr>
-      <w:bookmarkStart w:id="266" w:name="X36cbf7c8750cd854ae19409930ca35269b38594"/>
+      <w:bookmarkStart w:id="275" w:name="X36cbf7c8750cd854ae19409930ca35269b38594"/>
       <w:r>
         <w:rPr>
           <w:rStyle w:val="SectionNumber"/>
@@ -21293,8 +21369,8 @@
       <w:pPr>
         <w:pStyle w:val="Heading2"/>
       </w:pPr>
-      <w:bookmarkStart w:id="267" w:name="trade-offs-among-all-three-objectives"/>
-      <w:bookmarkEnd w:id="266"/>
+      <w:bookmarkStart w:id="276" w:name="trade-offs-among-all-three-objectives"/>
+      <w:bookmarkEnd w:id="275"/>
       <w:r>
         <w:rPr>
           <w:rStyle w:val="SectionNumber"/>
@@ -21325,7 +21401,7 @@
       <w:r>
         <w:t>Clear</w:t>
       </w:r>
-      <w:ins w:id="268" w:author="Leland Scantlebury" w:date="2026-05-18T15:18:00Z" w16du:dateUtc="2026-05-18T22:18:00Z">
+      <w:ins w:id="277" w:author="Leland Scantlebury" w:date="2026-05-18T15:18:00Z" w16du:dateUtc="2026-05-18T22:18:00Z">
         <w:r>
           <w:t>l</w:t>
         </w:r>
@@ -21346,8 +21422,8 @@
       <w:pPr>
         <w:pStyle w:val="Heading2"/>
       </w:pPr>
-      <w:bookmarkStart w:id="269" w:name="Xb48c0b1c357814727cacf50afe35e98b0bf92dd"/>
-      <w:bookmarkEnd w:id="267"/>
+      <w:bookmarkStart w:id="278" w:name="Xb48c0b1c357814727cacf50afe35e98b0bf92dd"/>
+      <w:bookmarkEnd w:id="276"/>
       <w:r>
         <w:rPr>
           <w:rStyle w:val="SectionNumber"/>
@@ -21379,9 +21455,9 @@
       <w:pPr>
         <w:pStyle w:val="Heading1"/>
       </w:pPr>
-      <w:bookmarkStart w:id="270" w:name="conclusion"/>
-      <w:bookmarkEnd w:id="265"/>
-      <w:bookmarkEnd w:id="269"/>
+      <w:bookmarkStart w:id="279" w:name="conclusion"/>
+      <w:bookmarkEnd w:id="274"/>
+      <w:bookmarkEnd w:id="278"/>
       <w:r>
         <w:rPr>
           <w:rStyle w:val="SectionNumber"/>
@@ -21428,7 +21504,7 @@
       <w:r>
         <w:t xml:space="preserve"> is influenced by the specific flow metrics included in the environmental objective function (explored further in Discussion</w:t>
       </w:r>
-      <w:del w:id="271" w:author="Leland Scantlebury" w:date="2026-05-18T15:23:00Z" w16du:dateUtc="2026-05-18T22:23:00Z">
+      <w:del w:id="280" w:author="Leland Scantlebury" w:date="2026-05-18T15:23:00Z" w16du:dateUtc="2026-05-18T22:23:00Z">
         <w:r>
           <w:delText>.</w:delText>
         </w:r>
@@ -21436,7 +21512,7 @@
       <w:r>
         <w:t>)</w:t>
       </w:r>
-      <w:ins w:id="272" w:author="Leland Scantlebury" w:date="2026-05-18T15:24:00Z" w16du:dateUtc="2026-05-18T22:24:00Z">
+      <w:ins w:id="281" w:author="Leland Scantlebury" w:date="2026-05-18T15:24:00Z" w16du:dateUtc="2026-05-18T22:24:00Z">
         <w:r>
           <w:t>.</w:t>
         </w:r>
@@ -21449,13 +21525,13 @@
       <w:r>
         <w:t xml:space="preserve">Rather than perform a randomized sampling of the full range of decision variables, this study builds on an existing public water management process (and informal transdisciplinary collaborative), taking stakeholder-proposed management options as a pre-screened, </w:t>
       </w:r>
-      <w:commentRangeStart w:id="273"/>
-      <w:del w:id="274" w:author="Leland Scantlebury" w:date="2026-05-18T15:24:00Z" w16du:dateUtc="2026-05-18T22:24:00Z">
+      <w:commentRangeStart w:id="282"/>
+      <w:del w:id="283" w:author="Leland Scantlebury" w:date="2026-05-18T15:24:00Z" w16du:dateUtc="2026-05-18T22:24:00Z">
         <w:r>
           <w:delText>computationally-feasible</w:delText>
         </w:r>
       </w:del>
-      <w:ins w:id="275" w:author="Leland Scantlebury" w:date="2026-05-18T15:24:00Z" w16du:dateUtc="2026-05-18T22:24:00Z">
+      <w:ins w:id="284" w:author="Leland Scantlebury" w:date="2026-05-18T15:24:00Z" w16du:dateUtc="2026-05-18T22:24:00Z">
         <w:r>
           <w:t>computationally feasible</w:t>
         </w:r>
@@ -21463,19 +21539,19 @@
       <w:r>
         <w:t xml:space="preserve"> </w:t>
       </w:r>
-      <w:commentRangeEnd w:id="273"/>
+      <w:commentRangeEnd w:id="282"/>
       <w:r>
         <w:rPr>
           <w:rStyle w:val="CommentReference"/>
           <w:sz w:val="24"/>
           <w:szCs w:val="24"/>
         </w:rPr>
-        <w:commentReference w:id="273"/>
+        <w:commentReference w:id="282"/>
       </w:r>
       <w:r>
         <w:t>set of scenarios for simulation. Among the set of options considered here, it takes a high infrastructure cost (reservoir scenarios) to escape the trade-offs defined in the regulatory scenario categories. Furthermore, although the existing GSP management priorities emphasized minimal agricultural water cuts, the Pareto-optimal set of management actions included many regulatory approaches and high-cost reservoir scenarios. We should note that the optimal set includes complete cessation of irrigated agriculture, because it yielded the maximum environmental benefit, demonstrating that not all</w:t>
       </w:r>
-      <w:del w:id="276" w:author="Leland Scantlebury" w:date="2026-05-18T15:24:00Z" w16du:dateUtc="2026-05-18T22:24:00Z">
+      <w:del w:id="285" w:author="Leland Scantlebury" w:date="2026-05-18T15:24:00Z" w16du:dateUtc="2026-05-18T22:24:00Z">
         <w:r>
           <w:delText xml:space="preserve"> of</w:delText>
         </w:r>
@@ -21491,12 +21567,12 @@
       <w:r>
         <w:t xml:space="preserve">In this case study, we demonstrate that in basins using hydrologic models for water management, a scenario design process conducted in a public collaborative setting can yield a </w:t>
       </w:r>
-      <w:del w:id="277" w:author="Leland Scantlebury" w:date="2026-05-18T15:29:00Z" w16du:dateUtc="2026-05-18T22:29:00Z">
+      <w:del w:id="286" w:author="Leland Scantlebury" w:date="2026-05-18T15:29:00Z" w16du:dateUtc="2026-05-18T22:29:00Z">
         <w:r>
           <w:delText>politically-relevant</w:delText>
         </w:r>
       </w:del>
-      <w:ins w:id="278" w:author="Leland Scantlebury" w:date="2026-05-18T15:29:00Z" w16du:dateUtc="2026-05-18T22:29:00Z">
+      <w:ins w:id="287" w:author="Leland Scantlebury" w:date="2026-05-18T15:29:00Z" w16du:dateUtc="2026-05-18T22:29:00Z">
         <w:r>
           <w:t>politically relevant</w:t>
         </w:r>
@@ -21514,8 +21590,8 @@
       <w:pPr>
         <w:pStyle w:val="Heading1"/>
       </w:pPr>
-      <w:bookmarkStart w:id="279" w:name="acknowledgments"/>
-      <w:bookmarkEnd w:id="270"/>
+      <w:bookmarkStart w:id="288" w:name="acknowledgments"/>
+      <w:bookmarkEnd w:id="279"/>
       <w:r>
         <w:lastRenderedPageBreak/>
         <w:t>Acknowledgments</w:t>
@@ -21525,8 +21601,8 @@
       <w:pPr>
         <w:pStyle w:val="Heading1"/>
       </w:pPr>
-      <w:bookmarkStart w:id="280" w:name="references"/>
-      <w:bookmarkEnd w:id="279"/>
+      <w:bookmarkStart w:id="289" w:name="references"/>
+      <w:bookmarkEnd w:id="288"/>
       <w:r>
         <w:rPr>
           <w:rStyle w:val="SectionNumber"/>
@@ -21542,8 +21618,8 @@
       <w:pPr>
         <w:pStyle w:val="Bibliography"/>
       </w:pPr>
-      <w:bookmarkStart w:id="281" w:name="ref-AgrawalEtAlPREDICTING2005"/>
-      <w:bookmarkStart w:id="282" w:name="refs"/>
+      <w:bookmarkStart w:id="290" w:name="ref-AgrawalEtAlPREDICTING2005"/>
+      <w:bookmarkStart w:id="291" w:name="refs"/>
       <w:r>
         <w:t xml:space="preserve">Agrawal, A, R S Schick, E P </w:t>
       </w:r>
@@ -21560,8 +21636,8 @@
       <w:pPr>
         <w:pStyle w:val="Bibliography"/>
       </w:pPr>
-      <w:bookmarkStart w:id="283" w:name="ref-BaruchEtAlMimicking2024"/>
-      <w:bookmarkEnd w:id="281"/>
+      <w:bookmarkStart w:id="292" w:name="ref-BaruchEtAlMimicking2024"/>
+      <w:bookmarkEnd w:id="290"/>
       <w:r>
         <w:t xml:space="preserve">Baruch, Ethan M., Sarah M. Yarnell, Theodore E. Grantham, Jessica R. Ayers, Andrew L. Rypel, and Robert A. Lusardi. 2024. “Mimicking Functional Elements of the Natural Flow Regime Promotes Native Fish Recovery in a Regulated River.” </w:t>
       </w:r>
@@ -21591,8 +21667,8 @@
       <w:pPr>
         <w:pStyle w:val="Bibliography"/>
       </w:pPr>
-      <w:bookmarkStart w:id="284" w:name="ref-BorkHirokawaTrends2021"/>
-      <w:bookmarkEnd w:id="283"/>
+      <w:bookmarkStart w:id="293" w:name="ref-BorkHirokawaTrends2021"/>
+      <w:bookmarkEnd w:id="292"/>
       <w:r>
         <w:t xml:space="preserve">Bork, Karrigan, and Keith Hirokawa. 2021. “Trends in Local Ecosystem Governance.” </w:t>
       </w:r>
@@ -21622,8 +21698,8 @@
       <w:pPr>
         <w:pStyle w:val="Bibliography"/>
       </w:pPr>
-      <w:bookmarkStart w:id="285" w:name="ref-BrownEtAlFuture2015"/>
-      <w:bookmarkEnd w:id="284"/>
+      <w:bookmarkStart w:id="294" w:name="ref-BrownEtAlFuture2015"/>
+      <w:bookmarkEnd w:id="293"/>
       <w:r>
         <w:t xml:space="preserve">Brown, Casey M., Jay R. Lund, Ximing Cai, Patrick M. Reed, Edith A. </w:t>
       </w:r>
@@ -21677,8 +21753,8 @@
       <w:pPr>
         <w:pStyle w:val="Bibliography"/>
       </w:pPr>
-      <w:bookmarkStart w:id="286" w:name="ref-BrownEtAlHistorical1994"/>
-      <w:bookmarkEnd w:id="285"/>
+      <w:bookmarkStart w:id="295" w:name="ref-BrownEtAlHistorical1994"/>
+      <w:bookmarkEnd w:id="294"/>
       <w:r>
         <w:t xml:space="preserve">Brown, Larry R., Peter B. Moyle, and Ronald M. Yoshiyama. 1994. “Historical Decline and Current Status of Coho Salmon in California.” </w:t>
       </w:r>
@@ -21708,8 +21784,8 @@
       <w:pPr>
         <w:pStyle w:val="Bibliography"/>
       </w:pPr>
-      <w:bookmarkStart w:id="287" w:name="ref-CDFWInfluence2021"/>
-      <w:bookmarkEnd w:id="286"/>
+      <w:bookmarkStart w:id="296" w:name="ref-CDFWInfluence2021"/>
+      <w:bookmarkEnd w:id="295"/>
       <w:r>
         <w:t>California Department of Fish and Wildlife. 2021. “Appendix 2: Influence of Scott River in-Stream Flow on the Distribution and Migration Timing of Fall Chinook Salmon and Coho Salmon.”</w:t>
       </w:r>
@@ -21718,8 +21794,8 @@
       <w:pPr>
         <w:pStyle w:val="Bibliography"/>
       </w:pPr>
-      <w:bookmarkStart w:id="288" w:name="X7c5765d4bf46367820355fe718939efb3be661f"/>
-      <w:bookmarkEnd w:id="287"/>
+      <w:bookmarkStart w:id="297" w:name="X7c5765d4bf46367820355fe718939efb3be661f"/>
+      <w:bookmarkEnd w:id="296"/>
       <w:r>
         <w:t xml:space="preserve">California Department of Water Resources. 2017. “Statewide Crop Mapping - 2016 Statewide Crop Mapping GIS Shapefiles - California Natural Resources Agency Open Data.” </w:t>
       </w:r>
@@ -21738,8 +21814,8 @@
       <w:pPr>
         <w:pStyle w:val="Bibliography"/>
       </w:pPr>
-      <w:bookmarkStart w:id="289" w:name="ref-CADWRGroundwater2023"/>
-      <w:bookmarkEnd w:id="288"/>
+      <w:bookmarkStart w:id="298" w:name="ref-CADWRGroundwater2023"/>
+      <w:bookmarkEnd w:id="297"/>
       <w:r>
         <w:t xml:space="preserve">———. 2023. “Groundwater Sustainability Plan Assessments: 1-005 SCOTT RIVER VALLEY.” </w:t>
       </w:r>
@@ -21758,8 +21834,8 @@
       <w:pPr>
         <w:pStyle w:val="Bibliography"/>
       </w:pPr>
-      <w:bookmarkStart w:id="290" w:name="ref-CNRAEtAlCalifornias2022"/>
-      <w:bookmarkEnd w:id="289"/>
+      <w:bookmarkStart w:id="299" w:name="ref-CNRAEtAlCalifornias2022"/>
+      <w:bookmarkEnd w:id="298"/>
       <w:r>
         <w:t xml:space="preserve">California Natural Resources Agency, California </w:t>
       </w:r>
@@ -21780,8 +21856,8 @@
       <w:pPr>
         <w:pStyle w:val="Bibliography"/>
       </w:pPr>
-      <w:bookmarkStart w:id="291" w:name="X6ef878f889213098c200c5acad35595649e9db2"/>
-      <w:bookmarkEnd w:id="290"/>
+      <w:bookmarkStart w:id="300" w:name="X6ef878f889213098c200c5acad35595649e9db2"/>
+      <w:bookmarkEnd w:id="299"/>
       <w:r>
         <w:t>California State Water Resources Control Board (SWRCB). 1975. “Report on Hydrogeologic Conditions, Scott River Valley, Scott River Valley.”</w:t>
       </w:r>
@@ -21790,8 +21866,8 @@
       <w:pPr>
         <w:pStyle w:val="Bibliography"/>
       </w:pPr>
-      <w:bookmarkStart w:id="292" w:name="ref-CardwellEtAlDesigning1996"/>
-      <w:bookmarkEnd w:id="291"/>
+      <w:bookmarkStart w:id="301" w:name="ref-CardwellEtAlDesigning1996"/>
+      <w:bookmarkEnd w:id="300"/>
       <w:r>
         <w:t xml:space="preserve">Cardwell, Hal, Henriette I. Jager, and Michael J. Sale. 1996. “Designing Instream Flows to Satisfy Fish and Human Water Needs.” </w:t>
       </w:r>
@@ -21821,8 +21897,8 @@
       <w:pPr>
         <w:pStyle w:val="Bibliography"/>
       </w:pPr>
-      <w:bookmarkStart w:id="293" w:name="ref-CarpenterAccurately2024"/>
-      <w:bookmarkEnd w:id="292"/>
+      <w:bookmarkStart w:id="302" w:name="ref-CarpenterAccurately2024"/>
+      <w:bookmarkEnd w:id="301"/>
       <w:r>
         <w:t>Carpenter, Cameron. 2024. “Accurately Identifying Functional Flow Metrics in Flashy and Highly Altered Stream Systems.” Master’s thesis, University of California, Davis.</w:t>
       </w:r>
@@ -21831,8 +21907,8 @@
       <w:pPr>
         <w:pStyle w:val="Bibliography"/>
       </w:pPr>
-      <w:bookmarkStart w:id="294" w:name="ref-CarterSheafferAlfalfa1983"/>
-      <w:bookmarkEnd w:id="293"/>
+      <w:bookmarkStart w:id="303" w:name="ref-CarterSheafferAlfalfa1983"/>
+      <w:bookmarkEnd w:id="302"/>
       <w:r>
         <w:t>Carter, P. R., and C. C. Sheaffer. 1983. “Alfalfa Response to Soil Water Deficits. I. Growth, Forage Quality, Yield, Water Use, and Water-Use Efficiency</w:t>
       </w:r>
@@ -21871,8 +21947,8 @@
       <w:pPr>
         <w:pStyle w:val="Bibliography"/>
       </w:pPr>
-      <w:bookmarkStart w:id="295" w:name="ref-CohonMarksMultiobjective1973"/>
-      <w:bookmarkEnd w:id="294"/>
+      <w:bookmarkStart w:id="304" w:name="ref-CohonMarksMultiobjective1973"/>
+      <w:bookmarkEnd w:id="303"/>
       <w:r>
         <w:t>Cohon, Jared L., and David H. Marks. 1973. “</w:t>
       </w:r>
@@ -21910,8 +21986,8 @@
       <w:pPr>
         <w:pStyle w:val="Bibliography"/>
       </w:pPr>
-      <w:bookmarkStart w:id="296" w:name="ref-CohonMarksReview1975"/>
-      <w:bookmarkEnd w:id="295"/>
+      <w:bookmarkStart w:id="305" w:name="ref-CohonMarksReview1975"/>
+      <w:bookmarkEnd w:id="304"/>
       <w:r>
         <w:t xml:space="preserve">———. 1975. “A Review and Evaluation of </w:t>
       </w:r>
@@ -21949,8 +22025,8 @@
       <w:pPr>
         <w:pStyle w:val="Bibliography"/>
       </w:pPr>
-      <w:bookmarkStart w:id="297" w:name="ref-DiBaldassarreEtAlSociohydrology2019"/>
-      <w:bookmarkEnd w:id="296"/>
+      <w:bookmarkStart w:id="306" w:name="ref-DiBaldassarreEtAlSociohydrology2019"/>
+      <w:bookmarkEnd w:id="305"/>
       <w:r>
         <w:t xml:space="preserve">Di Baldassarre, Giuliano, Murugesu Sivapalan, Maria Rusca, Christophe </w:t>
       </w:r>
@@ -21996,8 +22072,8 @@
       <w:pPr>
         <w:pStyle w:val="Bibliography"/>
       </w:pPr>
-      <w:bookmarkStart w:id="298" w:name="ref-DietzEtAlStruggle2003"/>
-      <w:bookmarkEnd w:id="297"/>
+      <w:bookmarkStart w:id="307" w:name="ref-DietzEtAlStruggle2003"/>
+      <w:bookmarkEnd w:id="306"/>
       <w:r>
         <w:t xml:space="preserve">Dietz, Thomas, Elinor Ostrom, and Paul C. Stern. 2003. “The Struggle to Govern the Commons.” </w:t>
       </w:r>
@@ -22027,8 +22103,8 @@
       <w:pPr>
         <w:pStyle w:val="Bibliography"/>
       </w:pPr>
-      <w:bookmarkStart w:id="299" w:name="ref-FogliaEtAlScott2013"/>
-      <w:bookmarkEnd w:id="298"/>
+      <w:bookmarkStart w:id="308" w:name="ref-FogliaEtAlScott2013"/>
+      <w:bookmarkEnd w:id="307"/>
       <w:r>
         <w:t>Foglia, Laura, Alison McNally, Courtney Hall, Lauren Ledesma, Ryan Hines, and Thomas Harter. 2013. “Scott Valley Integrated Hydrologic Model: Data Collection, Analysis, and Water Budget.” Davis, CA: North Coast Regional Water Quality Control Board.</w:t>
       </w:r>
@@ -22037,8 +22113,8 @@
       <w:pPr>
         <w:pStyle w:val="Bibliography"/>
       </w:pPr>
-      <w:bookmarkStart w:id="300" w:name="Xff198d1a9510a26c6b6a97c9924d7fdc8be1418"/>
-      <w:bookmarkEnd w:id="299"/>
+      <w:bookmarkStart w:id="309" w:name="Xff198d1a9510a26c6b6a97c9924d7fdc8be1418"/>
+      <w:bookmarkEnd w:id="308"/>
       <w:r>
         <w:t xml:space="preserve">Fox Canyon Groundwater Management Agency. 2019. “Groundwater Sustainability Plan for the Oxnard Subbasin.” Ventura, CA: Fox Canyon Groundwater </w:t>
       </w:r>
@@ -22055,8 +22131,8 @@
       <w:pPr>
         <w:pStyle w:val="Bibliography"/>
       </w:pPr>
-      <w:bookmarkStart w:id="301" w:name="ref-FreemanWICKED2000"/>
-      <w:bookmarkEnd w:id="300"/>
+      <w:bookmarkStart w:id="310" w:name="ref-FreemanWICKED2000"/>
+      <w:bookmarkEnd w:id="309"/>
       <w:r>
         <w:t xml:space="preserve">Freeman, David M. 2000. “WICKED WATER PROBLEMS: SOCIOLOGY AND LOCAL WATER ORGANIZATIONS IN ADDRESSING WATER RESOURCES POLICY.” </w:t>
       </w:r>
@@ -22086,8 +22162,8 @@
       <w:pPr>
         <w:pStyle w:val="Bibliography"/>
       </w:pPr>
-      <w:bookmarkStart w:id="302" w:name="ref-GorelickReview1983"/>
-      <w:bookmarkEnd w:id="301"/>
+      <w:bookmarkStart w:id="311" w:name="ref-GorelickReview1983"/>
+      <w:bookmarkEnd w:id="310"/>
       <w:r>
         <w:t xml:space="preserve">Gorelick, Steven M. 1983. “A Review of Distributed Parameter Groundwater Management Modeling Methods.” </w:t>
       </w:r>
@@ -22117,8 +22193,8 @@
       <w:pPr>
         <w:pStyle w:val="Bibliography"/>
       </w:pPr>
-      <w:bookmarkStart w:id="303" w:name="ref-HarterHinesSCOTT2008"/>
-      <w:bookmarkEnd w:id="302"/>
+      <w:bookmarkStart w:id="312" w:name="ref-HarterHinesSCOTT2008"/>
+      <w:bookmarkEnd w:id="311"/>
       <w:r>
         <w:lastRenderedPageBreak/>
         <w:t>Harter, Thomas, and Ryan Hines. 2008. “SCOTT VALLEY COMMUNITY GROUNDWATER STUDY PLAN.” University of California, Davis.</w:t>
@@ -22128,8 +22204,8 @@
       <w:pPr>
         <w:pStyle w:val="Bibliography"/>
       </w:pPr>
-      <w:bookmarkStart w:id="304" w:name="ref-HerzbergInstitutional2020"/>
-      <w:bookmarkEnd w:id="303"/>
+      <w:bookmarkStart w:id="313" w:name="ref-HerzbergInstitutional2020"/>
+      <w:bookmarkEnd w:id="312"/>
       <w:r>
         <w:t xml:space="preserve">Herzberg, Roberta Q. 2020. “Institutional Diversity, Self- Governance, and Tragedy Diverted.” </w:t>
       </w:r>
@@ -22159,8 +22235,8 @@
       <w:pPr>
         <w:pStyle w:val="Bibliography"/>
       </w:pPr>
-      <w:bookmarkStart w:id="305" w:name="ref-JagerRoseDesigning2003"/>
-      <w:bookmarkEnd w:id="304"/>
+      <w:bookmarkStart w:id="314" w:name="ref-JagerRoseDesigning2003"/>
+      <w:bookmarkEnd w:id="313"/>
       <w:r>
         <w:t xml:space="preserve">Jager, Henriette I., and Kenneth A. Rose. 2003. “Designing Optimal Flow Patterns for Fall Chinook Salmon in a Central Valley, California, River.” </w:t>
       </w:r>
@@ -22190,8 +22266,8 @@
       <w:pPr>
         <w:pStyle w:val="Bibliography"/>
       </w:pPr>
-      <w:bookmarkStart w:id="306" w:name="ref-KapelanEtAlMultiobjective2005"/>
-      <w:bookmarkEnd w:id="305"/>
+      <w:bookmarkStart w:id="315" w:name="ref-KapelanEtAlMultiobjective2005"/>
+      <w:bookmarkEnd w:id="314"/>
       <w:r>
         <w:t>Kapelan, Zoran S., Dragan A. Savic, and Godfrey A. Walters. 2005. “</w:t>
       </w:r>
@@ -22229,8 +22305,8 @@
       <w:pPr>
         <w:pStyle w:val="Bibliography"/>
       </w:pPr>
-      <w:bookmarkStart w:id="307" w:name="ref-KnappEtAlPlacing2019"/>
-      <w:bookmarkEnd w:id="306"/>
+      <w:bookmarkStart w:id="316" w:name="ref-KnappEtAlPlacing2019"/>
+      <w:bookmarkEnd w:id="315"/>
       <w:r>
         <w:t xml:space="preserve">Knapp, Corrine </w:t>
       </w:r>
@@ -22276,8 +22352,8 @@
       <w:pPr>
         <w:pStyle w:val="Bibliography"/>
       </w:pPr>
-      <w:bookmarkStart w:id="308" w:name="ref-KnechtleGiudice20192020"/>
-      <w:bookmarkEnd w:id="307"/>
+      <w:bookmarkStart w:id="317" w:name="ref-KnechtleGiudice20192020"/>
+      <w:bookmarkEnd w:id="316"/>
       <w:proofErr w:type="spellStart"/>
       <w:r>
         <w:t>Knechtle</w:t>
@@ -22291,8 +22367,8 @@
       <w:pPr>
         <w:pStyle w:val="Bibliography"/>
       </w:pPr>
-      <w:bookmarkStart w:id="309" w:name="ref-KoubaEtAlWatershedSpecific2025"/>
-      <w:bookmarkEnd w:id="308"/>
+      <w:bookmarkStart w:id="318" w:name="ref-KoubaEtAlWatershedSpecific2025"/>
+      <w:bookmarkEnd w:id="317"/>
       <w:r>
         <w:t xml:space="preserve">Kouba, Claire, Leland Scantlebury, Jason Wiener, Sarah Yarnell, and Thomas Harter. 2025. “A Watershed-Specific Approach to Identify Key Functional Flow Metrics Supporting Salmon Reproduction.” </w:t>
       </w:r>
@@ -22340,8 +22416,8 @@
       <w:pPr>
         <w:pStyle w:val="Bibliography"/>
       </w:pPr>
-      <w:bookmarkStart w:id="310" w:name="ref-LabadieOptimal2004"/>
-      <w:bookmarkEnd w:id="309"/>
+      <w:bookmarkStart w:id="319" w:name="ref-LabadieOptimal2004"/>
+      <w:bookmarkEnd w:id="318"/>
       <w:r>
         <w:t xml:space="preserve">Labadie, John W. 2004. “Optimal Operation of </w:t>
       </w:r>
@@ -22379,8 +22455,8 @@
       <w:pPr>
         <w:pStyle w:val="Bibliography"/>
       </w:pPr>
-      <w:bookmarkStart w:id="311" w:name="ref-MaassEtAl11962"/>
-      <w:bookmarkEnd w:id="310"/>
+      <w:bookmarkStart w:id="320" w:name="ref-MaassEtAl11962"/>
+      <w:bookmarkEnd w:id="319"/>
       <w:r>
         <w:t xml:space="preserve">Maass, Arthur, Maynard M. </w:t>
       </w:r>
@@ -22418,8 +22494,8 @@
       <w:pPr>
         <w:pStyle w:val="Bibliography"/>
       </w:pPr>
-      <w:bookmarkStart w:id="312" w:name="ref-MackGeology1958"/>
-      <w:bookmarkEnd w:id="311"/>
+      <w:bookmarkStart w:id="321" w:name="ref-MackGeology1958"/>
+      <w:bookmarkEnd w:id="320"/>
       <w:r>
         <w:t xml:space="preserve">Mack, Seymour. 1958. “Geology and Ground-Water Features of Scott Valley, Siskiyou County, California.” Geological {{Survey Water-Supply Paper}} 1462. United States Geological Survey. </w:t>
       </w:r>
@@ -22439,8 +22515,8 @@
       <w:pPr>
         <w:pStyle w:val="Bibliography"/>
       </w:pPr>
-      <w:bookmarkStart w:id="313" w:name="ref-MagranetScott2015a"/>
-      <w:bookmarkEnd w:id="312"/>
+      <w:bookmarkStart w:id="322" w:name="ref-MagranetScott2015a"/>
+      <w:bookmarkEnd w:id="321"/>
       <w:proofErr w:type="spellStart"/>
       <w:r>
         <w:t>Magranet</w:t>
@@ -22454,8 +22530,8 @@
       <w:pPr>
         <w:pStyle w:val="Bibliography"/>
       </w:pPr>
-      <w:bookmarkStart w:id="314" w:name="ref-MagranetScott2017"/>
-      <w:bookmarkEnd w:id="313"/>
+      <w:bookmarkStart w:id="323" w:name="ref-MagranetScott2017"/>
+      <w:bookmarkEnd w:id="322"/>
       <w:r>
         <w:t>———. 2017. “Scott River Fall Chinook Spawning Ground Surveys.” Etna, CA: Siskiyou Resource Conservation District.</w:t>
       </w:r>
@@ -22464,8 +22540,8 @@
       <w:pPr>
         <w:pStyle w:val="Bibliography"/>
       </w:pPr>
-      <w:bookmarkStart w:id="315" w:name="ref-MagranetScott2018"/>
-      <w:bookmarkEnd w:id="314"/>
+      <w:bookmarkStart w:id="324" w:name="ref-MagranetScott2018"/>
+      <w:bookmarkEnd w:id="323"/>
       <w:r>
         <w:lastRenderedPageBreak/>
         <w:t>———. 2018. “Scott River Fall Chinook Spawning Ground Surveys 2017 Season.” Etna, CA: Siskiyou Resource Conservation District.</w:t>
@@ -22475,8 +22551,8 @@
       <w:pPr>
         <w:pStyle w:val="Bibliography"/>
       </w:pPr>
-      <w:bookmarkStart w:id="316" w:name="ref-MagranetYokelScott2017"/>
-      <w:bookmarkEnd w:id="315"/>
+      <w:bookmarkStart w:id="325" w:name="ref-MagranetYokelScott2017"/>
+      <w:bookmarkEnd w:id="324"/>
       <w:proofErr w:type="spellStart"/>
       <w:r>
         <w:t>Magranet</w:t>
@@ -22490,8 +22566,8 @@
       <w:pPr>
         <w:pStyle w:val="Bibliography"/>
       </w:pPr>
-      <w:bookmarkStart w:id="317" w:name="ref-MahoneyRoodStreamflow1998"/>
-      <w:bookmarkEnd w:id="316"/>
+      <w:bookmarkStart w:id="326" w:name="ref-MahoneyRoodStreamflow1998"/>
+      <w:bookmarkEnd w:id="325"/>
       <w:r>
         <w:t xml:space="preserve">Mahoney, John M., and Stewart B. Rood. 1998. “Streamflow Requirements for Cottonwood Seedling Recruitment—An Integrative Model.” </w:t>
       </w:r>
@@ -22521,8 +22597,8 @@
       <w:pPr>
         <w:pStyle w:val="Bibliography"/>
       </w:pPr>
-      <w:bookmarkStart w:id="318" w:name="ref-McMahonHabitat1983"/>
-      <w:bookmarkEnd w:id="317"/>
+      <w:bookmarkStart w:id="327" w:name="ref-McMahonHabitat1983"/>
+      <w:bookmarkEnd w:id="326"/>
       <w:r>
         <w:t>McMahon, Thomas E. 1983. “Habitat Suitability Index Models: Coho Salmon.” FWS/OBS-82/10.49. U.S. Fish and Wildlife Service.</w:t>
       </w:r>
@@ -22531,8 +22607,8 @@
       <w:pPr>
         <w:pStyle w:val="Bibliography"/>
       </w:pPr>
-      <w:bookmarkStart w:id="319" w:name="ref-MillsDoakKeystoneSpecies1993"/>
-      <w:bookmarkEnd w:id="318"/>
+      <w:bookmarkStart w:id="328" w:name="ref-MillsDoakKeystoneSpecies1993"/>
+      <w:bookmarkEnd w:id="327"/>
       <w:r>
         <w:t xml:space="preserve">Mills, L. Scott, and Daniel F. Doak. 1993. “The Keystone-Species Concept in Ecology and Conservation.” </w:t>
       </w:r>
@@ -22564,8 +22640,8 @@
       <w:pPr>
         <w:pStyle w:val="Bibliography"/>
       </w:pPr>
-      <w:bookmarkStart w:id="320" w:name="ref-MonarchiEtAlInteractive1973"/>
-      <w:bookmarkEnd w:id="319"/>
+      <w:bookmarkStart w:id="329" w:name="ref-MonarchiEtAlInteractive1973"/>
+      <w:bookmarkEnd w:id="328"/>
       <w:proofErr w:type="spellStart"/>
       <w:r>
         <w:t>Monarchi</w:t>
@@ -22608,8 +22684,8 @@
       <w:pPr>
         <w:pStyle w:val="Bibliography"/>
       </w:pPr>
-      <w:bookmarkStart w:id="321" w:name="ref-MoyleCoho2002"/>
-      <w:bookmarkEnd w:id="320"/>
+      <w:bookmarkStart w:id="330" w:name="ref-MoyleCoho2002"/>
+      <w:bookmarkEnd w:id="329"/>
       <w:r>
         <w:t xml:space="preserve">Moyle, Peter B. 2002. “Coho Salmon, Oncorhynchus Kisutch (Walbaum).” In </w:t>
       </w:r>
@@ -22628,8 +22704,8 @@
       <w:pPr>
         <w:pStyle w:val="Bibliography"/>
       </w:pPr>
-      <w:bookmarkStart w:id="322" w:name="ref-NordgrenEtAlSupporting2016"/>
-      <w:bookmarkEnd w:id="321"/>
+      <w:bookmarkStart w:id="331" w:name="ref-NordgrenEtAlSupporting2016"/>
+      <w:bookmarkEnd w:id="330"/>
       <w:r>
         <w:t xml:space="preserve">Nordgren, John, Missy Stults, and Sara </w:t>
       </w:r>
@@ -22667,8 +22743,8 @@
       <w:pPr>
         <w:pStyle w:val="Bibliography"/>
       </w:pPr>
-      <w:bookmarkStart w:id="323" w:name="ref-OstromGoverning2015"/>
-      <w:bookmarkEnd w:id="322"/>
+      <w:bookmarkStart w:id="332" w:name="ref-OstromGoverning2015"/>
+      <w:bookmarkEnd w:id="331"/>
       <w:r>
         <w:t xml:space="preserve">Ostrom, Elinor. 2015. </w:t>
       </w:r>
@@ -22687,8 +22763,8 @@
       <w:pPr>
         <w:pStyle w:val="Bibliography"/>
       </w:pPr>
-      <w:bookmarkStart w:id="324" w:name="ref-ParetoCours1896"/>
-      <w:bookmarkEnd w:id="323"/>
+      <w:bookmarkStart w:id="333" w:name="ref-ParetoCours1896"/>
+      <w:bookmarkEnd w:id="332"/>
       <w:r>
         <w:t xml:space="preserve">Pareto, Vilfredo. 1896. </w:t>
       </w:r>
@@ -22723,8 +22799,8 @@
       <w:pPr>
         <w:pStyle w:val="Bibliography"/>
       </w:pPr>
-      <w:bookmarkStart w:id="325" w:name="ref-PattersonEtAlHydrologic2020"/>
-      <w:bookmarkEnd w:id="324"/>
+      <w:bookmarkStart w:id="334" w:name="ref-PattersonEtAlHydrologic2020"/>
+      <w:bookmarkEnd w:id="333"/>
       <w:r>
         <w:t xml:space="preserve">Patterson, Noelle K., Belize A. Lane, Samuel Sandoval-Solis, Gregory B. Pasternack, Sarah M. Yarnell, and </w:t>
       </w:r>
@@ -22762,8 +22838,8 @@
       <w:pPr>
         <w:pStyle w:val="Bibliography"/>
       </w:pPr>
-      <w:bookmarkStart w:id="326" w:name="ref-PoffEtAlNatural1997"/>
-      <w:bookmarkEnd w:id="325"/>
+      <w:bookmarkStart w:id="335" w:name="ref-PoffEtAlNatural1997"/>
+      <w:bookmarkEnd w:id="334"/>
       <w:r>
         <w:t xml:space="preserve">Poff, N. LeRoy, J. David Allan, Mark B. Bain, James R. Karr, Karen L. Prestegaard, Brian D. Richter, Richard E. Sparks, and Julie C. Stromberg. 1997. “The Natural Flow Regime.” </w:t>
       </w:r>
@@ -22795,8 +22871,8 @@
       <w:pPr>
         <w:pStyle w:val="Bibliography"/>
       </w:pPr>
-      <w:bookmarkStart w:id="327" w:name="ref-ReussCoping1992"/>
-      <w:bookmarkEnd w:id="326"/>
+      <w:bookmarkStart w:id="336" w:name="ref-ReussCoping1992"/>
+      <w:bookmarkEnd w:id="335"/>
       <w:r>
         <w:t xml:space="preserve">Reuss, Martin. 1992. “Coping </w:t>
       </w:r>
@@ -22823,8 +22899,8 @@
       <w:pPr>
         <w:pStyle w:val="Bibliography"/>
       </w:pPr>
-      <w:bookmarkStart w:id="328" w:name="ref-RichterEtAlMethod1996"/>
-      <w:bookmarkEnd w:id="327"/>
+      <w:bookmarkStart w:id="337" w:name="ref-RichterEtAlMethod1996"/>
+      <w:bookmarkEnd w:id="336"/>
       <w:r>
         <w:t xml:space="preserve">Richter, Brian D., Jeffrey V. Baumgartner, Jennifer Powell, and David P. Braun. 1996. “A Method for Assessing Hydrologic Alteration Within Ecosystems.” </w:t>
       </w:r>
@@ -22854,8 +22930,8 @@
       <w:pPr>
         <w:pStyle w:val="Bibliography"/>
       </w:pPr>
-      <w:bookmarkStart w:id="329" w:name="ref-RodellEtAlEmerging2018"/>
-      <w:bookmarkEnd w:id="328"/>
+      <w:bookmarkStart w:id="338" w:name="ref-RodellEtAlEmerging2018"/>
+      <w:bookmarkEnd w:id="337"/>
       <w:r>
         <w:lastRenderedPageBreak/>
         <w:t xml:space="preserve">Rodell, M., J. S. Famiglietti, D. N. Wiese, J. T. Reager, H. K. </w:t>
@@ -22894,8 +22970,8 @@
       <w:pPr>
         <w:pStyle w:val="Bibliography"/>
       </w:pPr>
-      <w:bookmarkStart w:id="330" w:name="ref-RogersFieringUse1986"/>
-      <w:bookmarkEnd w:id="329"/>
+      <w:bookmarkStart w:id="339" w:name="ref-RogersFieringUse1986"/>
+      <w:bookmarkEnd w:id="338"/>
       <w:r>
         <w:t xml:space="preserve">Rogers, Peter P., and Myron B </w:t>
       </w:r>
@@ -22933,8 +23009,8 @@
       <w:pPr>
         <w:pStyle w:val="Bibliography"/>
       </w:pPr>
-      <w:bookmarkStart w:id="331" w:name="ref-SahnehEtAlTen2021"/>
-      <w:bookmarkEnd w:id="330"/>
+      <w:bookmarkStart w:id="340" w:name="ref-SahnehEtAlTen2021"/>
+      <w:bookmarkEnd w:id="339"/>
       <w:proofErr w:type="spellStart"/>
       <w:r>
         <w:t>Sahneh</w:t>
@@ -22977,8 +23053,8 @@
       <w:pPr>
         <w:pStyle w:val="Bibliography"/>
       </w:pPr>
-      <w:bookmarkStart w:id="332" w:name="X35601437fc25b0fdd92b478f2f9ddeaed3398df"/>
-      <w:bookmarkEnd w:id="331"/>
+      <w:bookmarkStart w:id="341" w:name="X35601437fc25b0fdd92b478f2f9ddeaed3398df"/>
+      <w:bookmarkEnd w:id="340"/>
       <w:r>
         <w:t>Scott River Watershed Council. 2018. “Restoring Priority Coho Habitat in the Scott River Watershed Modeling and Planning Report.”</w:t>
       </w:r>
@@ -22987,8 +23063,8 @@
       <w:pPr>
         <w:pStyle w:val="Bibliography"/>
       </w:pPr>
-      <w:bookmarkStart w:id="333" w:name="X334218043bd9d5b07a848a610917fcfef0168db"/>
-      <w:bookmarkEnd w:id="332"/>
+      <w:bookmarkStart w:id="342" w:name="X334218043bd9d5b07a848a610917fcfef0168db"/>
+      <w:bookmarkEnd w:id="341"/>
       <w:r>
         <w:t>Scott Valley Area Plan Committee. 1980. “Scott Valley Area Plan.” Siskiyou County.</w:t>
       </w:r>
@@ -22997,8 +23073,8 @@
       <w:pPr>
         <w:pStyle w:val="Bibliography"/>
       </w:pPr>
-      <w:bookmarkStart w:id="334" w:name="ref-SiskiyouCountyScott2021"/>
-      <w:bookmarkEnd w:id="333"/>
+      <w:bookmarkStart w:id="343" w:name="ref-SiskiyouCountyScott2021"/>
+      <w:bookmarkEnd w:id="342"/>
       <w:r>
         <w:t>Siskiyou County. 2021. “Scott Valley Groundwater Sustainability Plan.”</w:t>
       </w:r>
@@ -23007,8 +23083,8 @@
       <w:pPr>
         <w:pStyle w:val="Bibliography"/>
       </w:pPr>
-      <w:bookmarkStart w:id="335" w:name="ref-SnyderEtAlLONGTERM2002"/>
-      <w:bookmarkEnd w:id="334"/>
+      <w:bookmarkStart w:id="344" w:name="ref-SnyderEtAlLONGTERM2002"/>
+      <w:bookmarkEnd w:id="343"/>
       <w:r>
         <w:t xml:space="preserve">Snyder, R. L., M. Orang, and S. </w:t>
       </w:r>
@@ -23055,8 +23131,8 @@
       <w:pPr>
         <w:pStyle w:val="Bibliography"/>
       </w:pPr>
-      <w:bookmarkStart w:id="336" w:name="X2560a5ce8c29a4d10823717cd7284f11df015d4"/>
-      <w:bookmarkEnd w:id="335"/>
+      <w:bookmarkStart w:id="345" w:name="X2560a5ce8c29a4d10823717cd7284f11df015d4"/>
+      <w:bookmarkEnd w:id="344"/>
       <w:r>
         <w:t xml:space="preserve">State Water Resources Control Board. 2021. “Establishment of Minimum Instream Flow Requirements, </w:t>
       </w:r>
@@ -23073,8 +23149,8 @@
       <w:pPr>
         <w:pStyle w:val="Bibliography"/>
       </w:pPr>
-      <w:bookmarkStart w:id="337" w:name="Xc65d78564b05799285cd4578f858a1851ca0d64"/>
-      <w:bookmarkEnd w:id="336"/>
+      <w:bookmarkStart w:id="346" w:name="Xc65d78564b05799285cd4578f858a1851ca0d64"/>
+      <w:bookmarkEnd w:id="345"/>
       <w:r>
         <w:t xml:space="preserve">———. 2024a. “Establishment of Minimum Instream Flow Requirements, </w:t>
       </w:r>
@@ -23091,8 +23167,8 @@
       <w:pPr>
         <w:pStyle w:val="Bibliography"/>
       </w:pPr>
-      <w:bookmarkStart w:id="338" w:name="Xa7b10fbb32571a990cee2341e679d296b855974"/>
-      <w:bookmarkEnd w:id="337"/>
+      <w:bookmarkStart w:id="347" w:name="Xa7b10fbb32571a990cee2341e679d296b855974"/>
+      <w:bookmarkEnd w:id="346"/>
       <w:r>
         <w:t>———. 2024b. “RESOLUTION NO. 2024-0036: REGARDING FLOW EFFORTS IN THE SCOTT RIVER AND SHASTA RIVER WATERSHEDS.” 2024-0036.</w:t>
       </w:r>
@@ -23101,8 +23177,8 @@
       <w:pPr>
         <w:pStyle w:val="Bibliography"/>
       </w:pPr>
-      <w:bookmarkStart w:id="339" w:name="ref-SunEtAlNexus2018"/>
-      <w:bookmarkEnd w:id="338"/>
+      <w:bookmarkStart w:id="348" w:name="ref-SunEtAlNexus2018"/>
+      <w:bookmarkEnd w:id="347"/>
       <w:r>
         <w:t xml:space="preserve">Sun, Zan, Yi Zheng, Xi Li, Yong Tian, Feng Han, Ye Zhong, Jie Liu, and </w:t>
       </w:r>
@@ -23140,8 +23216,8 @@
       <w:pPr>
         <w:pStyle w:val="Bibliography"/>
       </w:pPr>
-      <w:bookmarkStart w:id="340" w:name="ref-TharmeGlobal2003"/>
-      <w:bookmarkEnd w:id="339"/>
+      <w:bookmarkStart w:id="349" w:name="ref-TharmeGlobal2003"/>
+      <w:bookmarkEnd w:id="348"/>
       <w:proofErr w:type="spellStart"/>
       <w:r>
         <w:t>Tharme</w:t>
@@ -23176,8 +23252,8 @@
       <w:pPr>
         <w:pStyle w:val="Bibliography"/>
       </w:pPr>
-      <w:bookmarkStart w:id="341" w:name="ref-TolleyEtAlSensitivity2019"/>
-      <w:bookmarkEnd w:id="340"/>
+      <w:bookmarkStart w:id="350" w:name="ref-TolleyEtAlSensitivity2019"/>
+      <w:bookmarkEnd w:id="349"/>
       <w:r>
         <w:t xml:space="preserve">Tolley, D., L. Foglia, and T. Harter. 2019. “Sensitivity Analysis and Calibration of an Integrated Hydrologic Model in an Irrigated Agricultural Basin </w:t>
       </w:r>
@@ -23219,8 +23295,8 @@
       <w:pPr>
         <w:pStyle w:val="Bibliography"/>
       </w:pPr>
-      <w:bookmarkStart w:id="342" w:name="ref-WangCooperative2014"/>
-      <w:bookmarkEnd w:id="341"/>
+      <w:bookmarkStart w:id="351" w:name="ref-WangCooperative2014"/>
+      <w:bookmarkEnd w:id="350"/>
       <w:r>
         <w:t xml:space="preserve">Wang, Sun Ling. 2014. “Cooperative Extension System: Trends and Economic Impacts on U.S. Agriculture.” </w:t>
       </w:r>
@@ -23250,8 +23326,8 @@
       <w:pPr>
         <w:pStyle w:val="Bibliography"/>
       </w:pPr>
-      <w:bookmarkStart w:id="343" w:name="ref-WilliamsEtAlLarge2020"/>
-      <w:bookmarkEnd w:id="342"/>
+      <w:bookmarkStart w:id="352" w:name="ref-WilliamsEtAlLarge2020"/>
+      <w:bookmarkEnd w:id="351"/>
       <w:r>
         <w:t xml:space="preserve">Williams, A. Park, Edward R. Cook, Jason E. Smerdon, Benjamin I. Cook, John T. </w:t>
       </w:r>
@@ -23297,8 +23373,8 @@
       <w:pPr>
         <w:pStyle w:val="Bibliography"/>
       </w:pPr>
-      <w:bookmarkStart w:id="344" w:name="ref-WuEtAlOptimizing2015"/>
-      <w:bookmarkEnd w:id="343"/>
+      <w:bookmarkStart w:id="353" w:name="ref-WuEtAlOptimizing2015"/>
+      <w:bookmarkEnd w:id="352"/>
       <w:r>
         <w:t xml:space="preserve">Wu, Bin, Yi Zheng, Xin Wu, Yong Tian, Feng Han, Jie Liu, and </w:t>
       </w:r>
@@ -23336,8 +23412,8 @@
       <w:pPr>
         <w:pStyle w:val="Bibliography"/>
       </w:pPr>
-      <w:bookmarkStart w:id="345" w:name="ref-YarnellEtAlFunctional2015"/>
-      <w:bookmarkEnd w:id="344"/>
+      <w:bookmarkStart w:id="354" w:name="ref-YarnellEtAlFunctional2015"/>
+      <w:bookmarkEnd w:id="353"/>
       <w:r>
         <w:t xml:space="preserve">Yarnell, Sarah M., Geoffrey E. Petts, John C. Schmidt, Alison A. Whipple, Erin E. Beller, Clifford N. Dahm, Peter Goodwin, and Joshua H. Viers. 2015. “Functional Flows in Modified Riverscapes: Hydrographs, Habitats and Opportunities.” </w:t>
       </w:r>
@@ -23369,8 +23445,8 @@
       <w:pPr>
         <w:pStyle w:val="Bibliography"/>
       </w:pPr>
-      <w:bookmarkStart w:id="346" w:name="ref-YehBeckerMultiobjective1982"/>
-      <w:bookmarkEnd w:id="345"/>
+      <w:bookmarkStart w:id="355" w:name="ref-YehBeckerMultiobjective1982"/>
+      <w:bookmarkEnd w:id="354"/>
       <w:r>
         <w:t>Yeh, William W-G., and Leonard Becker. 1982. “</w:t>
       </w:r>
@@ -23416,19 +23492,19 @@
       <w:pPr>
         <w:pStyle w:val="Bibliography"/>
       </w:pPr>
-      <w:bookmarkStart w:id="347" w:name="X8bf5592004e543b04dfcfc3edb39663c8006d78"/>
-      <w:bookmarkEnd w:id="346"/>
+      <w:bookmarkStart w:id="356" w:name="X8bf5592004e543b04dfcfc3edb39663c8006d78"/>
+      <w:bookmarkEnd w:id="355"/>
       <w:r>
         <w:t>Yolo Subbasin Groundwater Agency. 2022. “Yolo Subbasin Groundwater Sustainability Plan.” Woodland, CA.</w:t>
       </w:r>
     </w:p>
-    <w:bookmarkEnd w:id="282"/>
-    <w:bookmarkEnd w:id="347"/>
+    <w:bookmarkEnd w:id="291"/>
+    <w:bookmarkEnd w:id="356"/>
     <w:p>
       <w:r>
         <w:br w:type="page"/>
       </w:r>
-      <w:bookmarkEnd w:id="280"/>
+      <w:bookmarkEnd w:id="289"/>
     </w:p>
     <w:sectPr>
       <w:footnotePr>
@@ -23641,7 +23717,23 @@
       </w:r>
     </w:p>
   </w:comment>
-  <w:comment w:id="117" w:author="Leland Scantlebury" w:date="2026-05-15T13:35:00Z" w:initials="LS">
+  <w:comment w:id="115" w:author="Kouba, Claire" w:date="2026-06-10T11:09:00Z" w:initials="CK">
+    <w:p>
+      <w:pPr>
+        <w:pStyle w:val="CommentText"/>
+      </w:pPr>
+      <w:r>
+        <w:rPr>
+          <w:rStyle w:val="CommentReference"/>
+        </w:rPr>
+        <w:annotationRef/>
+      </w:r>
+      <w:r>
+        <w:t>Added “excessive”</w:t>
+      </w:r>
+    </w:p>
+  </w:comment>
+  <w:comment w:id="118" w:author="Leland Scantlebury" w:date="2026-05-15T13:35:00Z" w:initials="LS">
     <w:p>
       <w:r>
         <w:rPr>
@@ -23658,7 +23750,7 @@
       </w:r>
     </w:p>
   </w:comment>
-  <w:comment w:id="137" w:author="Leland Scantlebury" w:date="2026-05-18T10:39:00Z" w:initials="LS">
+  <w:comment w:id="138" w:author="Leland Scantlebury" w:date="2026-05-18T10:39:00Z" w:initials="LS">
     <w:p>
       <w:r>
         <w:rPr>
@@ -23675,7 +23767,23 @@
       </w:r>
     </w:p>
   </w:comment>
-  <w:comment w:id="176" w:author="Leland Scantlebury" w:date="2026-05-15T15:47:00Z" w:initials="LS">
+  <w:comment w:id="139" w:author="Kouba, Claire" w:date="2026-06-10T11:11:00Z" w:initials="CK">
+    <w:p>
+      <w:pPr>
+        <w:pStyle w:val="CommentText"/>
+      </w:pPr>
+      <w:r>
+        <w:rPr>
+          <w:rStyle w:val="CommentReference"/>
+        </w:rPr>
+        <w:annotationRef/>
+      </w:r>
+      <w:r>
+        <w:t>Eh, good point, but seems like a digression</w:t>
+      </w:r>
+    </w:p>
+  </w:comment>
+  <w:comment w:id="178" w:author="Leland Scantlebury" w:date="2026-05-15T15:47:00Z" w:initials="LS">
     <w:p>
       <w:r>
         <w:rPr>
@@ -23695,7 +23803,7 @@
       </w:hyperlink>
     </w:p>
   </w:comment>
-  <w:comment w:id="183" w:author="Leland Scantlebury" w:date="2026-05-18T10:25:00Z" w:initials="LS">
+  <w:comment w:id="185" w:author="Leland Scantlebury" w:date="2026-05-18T10:25:00Z" w:initials="LS">
     <w:p>
       <w:r>
         <w:rPr>
@@ -23712,7 +23820,23 @@
       </w:r>
     </w:p>
   </w:comment>
-  <w:comment w:id="200" w:author="Leland Scantlebury" w:date="2026-05-18T10:33:00Z" w:initials="LS">
+  <w:comment w:id="186" w:author="Kouba, Claire" w:date="2026-06-10T11:18:00Z" w:initials="CK">
+    <w:p>
+      <w:pPr>
+        <w:pStyle w:val="CommentText"/>
+      </w:pPr>
+      <w:r>
+        <w:rPr>
+          <w:rStyle w:val="CommentReference"/>
+        </w:rPr>
+        <w:annotationRef/>
+      </w:r>
+      <w:r>
+        <w:t>nah</w:t>
+      </w:r>
+    </w:p>
+  </w:comment>
+  <w:comment w:id="203" w:author="Leland Scantlebury" w:date="2026-05-18T10:33:00Z" w:initials="LS">
     <w:p>
       <w:r>
         <w:rPr>
@@ -23729,7 +23853,7 @@
       </w:r>
     </w:p>
   </w:comment>
-  <w:comment w:id="204" w:author="Leland Scantlebury" w:date="2026-05-18T10:30:00Z" w:initials="LS">
+  <w:comment w:id="207" w:author="Leland Scantlebury" w:date="2026-05-18T10:30:00Z" w:initials="LS">
     <w:p>
       <w:r>
         <w:rPr>
@@ -23746,7 +23870,7 @@
       </w:r>
     </w:p>
   </w:comment>
-  <w:comment w:id="223" w:author="Leland Scantlebury" w:date="2026-05-18T10:49:00Z" w:initials="LS">
+  <w:comment w:id="226" w:author="Leland Scantlebury" w:date="2026-05-18T10:49:00Z" w:initials="LS">
     <w:p>
       <w:r>
         <w:rPr>
@@ -23763,7 +23887,23 @@
       </w:r>
     </w:p>
   </w:comment>
-  <w:comment w:id="229" w:author="Leland Scantlebury" w:date="2026-05-15T16:10:00Z" w:initials="LS">
+  <w:comment w:id="227" w:author="Kouba, Claire" w:date="2026-06-10T11:27:00Z" w:initials="CK">
+    <w:p>
+      <w:pPr>
+        <w:pStyle w:val="CommentText"/>
+      </w:pPr>
+      <w:r>
+        <w:rPr>
+          <w:rStyle w:val="CommentReference"/>
+        </w:rPr>
+        <w:annotationRef/>
+      </w:r>
+      <w:r>
+        <w:t>I think I will not do this until a reviewer asks</w:t>
+      </w:r>
+    </w:p>
+  </w:comment>
+  <w:comment w:id="233" w:author="Leland Scantlebury" w:date="2026-05-15T16:10:00Z" w:initials="LS">
     <w:p>
       <w:r>
         <w:rPr>
@@ -23780,7 +23920,7 @@
       </w:r>
     </w:p>
   </w:comment>
-  <w:comment w:id="228" w:author="Leland Scantlebury" w:date="2026-05-15T16:09:00Z" w:initials="LS">
+  <w:comment w:id="232" w:author="Leland Scantlebury" w:date="2026-05-15T16:09:00Z" w:initials="LS">
     <w:p>
       <w:r>
         <w:rPr>
@@ -23797,7 +23937,7 @@
       </w:r>
     </w:p>
   </w:comment>
-  <w:comment w:id="247" w:author="Leland Scantlebury" w:date="2026-05-18T14:59:00Z" w:initials="LS">
+  <w:comment w:id="251" w:author="Leland Scantlebury" w:date="2026-05-18T14:59:00Z" w:initials="LS">
     <w:p>
       <w:r>
         <w:rPr>
@@ -23814,7 +23954,23 @@
       </w:r>
     </w:p>
   </w:comment>
-  <w:comment w:id="249" w:author="Leland Scantlebury" w:date="2026-05-18T14:21:00Z" w:initials="LS">
+  <w:comment w:id="252" w:author="Kouba, Claire" w:date="2026-06-10T12:39:00Z" w:initials="CK">
+    <w:p>
+      <w:pPr>
+        <w:pStyle w:val="CommentText"/>
+      </w:pPr>
+      <w:r>
+        <w:rPr>
+          <w:rStyle w:val="CommentReference"/>
+        </w:rPr>
+        <w:annotationRef/>
+      </w:r>
+      <w:r>
+        <w:t>I worry that that would lead to a lot of flipping back and forth to figure out what was in the scenario descriptions.</w:t>
+      </w:r>
+    </w:p>
+  </w:comment>
+  <w:comment w:id="254" w:author="Leland Scantlebury" w:date="2026-05-18T14:21:00Z" w:initials="LS">
     <w:p>
       <w:r>
         <w:rPr>
@@ -23831,7 +23987,23 @@
       </w:r>
     </w:p>
   </w:comment>
-  <w:comment w:id="260" w:author="Leland Scantlebury" w:date="2026-05-18T14:30:00Z" w:initials="LS">
+  <w:comment w:id="255" w:author="Kouba, Claire" w:date="2026-06-10T15:11:00Z" w:initials="CK">
+    <w:p>
+      <w:pPr>
+        <w:pStyle w:val="CommentText"/>
+      </w:pPr>
+      <w:r>
+        <w:rPr>
+          <w:rStyle w:val="CommentReference"/>
+        </w:rPr>
+        <w:annotationRef/>
+      </w:r>
+      <w:r>
+        <w:t>Text added</w:t>
+      </w:r>
+    </w:p>
+  </w:comment>
+  <w:comment w:id="266" w:author="Leland Scantlebury" w:date="2026-05-18T14:30:00Z" w:initials="LS">
     <w:p>
       <w:r>
         <w:rPr>
@@ -23848,7 +24020,23 @@
       </w:r>
     </w:p>
   </w:comment>
-  <w:comment w:id="261" w:author="Leland Scantlebury" w:date="2026-05-18T14:28:00Z" w:initials="LS">
+  <w:comment w:id="267" w:author="Kouba, Claire" w:date="2026-06-10T14:33:00Z" w:initials="CK">
+    <w:p>
+      <w:pPr>
+        <w:pStyle w:val="CommentText"/>
+      </w:pPr>
+      <w:r>
+        <w:rPr>
+          <w:rStyle w:val="CommentReference"/>
+        </w:rPr>
+        <w:annotationRef/>
+      </w:r>
+      <w:r>
+        <w:t>Yes. I will make a gif of it (4 of them) and include them as supplemental info</w:t>
+      </w:r>
+    </w:p>
+  </w:comment>
+  <w:comment w:id="268" w:author="Leland Scantlebury" w:date="2026-05-18T14:28:00Z" w:initials="LS">
     <w:p>
       <w:r>
         <w:rPr>
@@ -23865,7 +24053,23 @@
       </w:r>
     </w:p>
   </w:comment>
-  <w:comment w:id="263" w:author="Leland Scantlebury" w:date="2026-05-18T15:16:00Z" w:initials="LS">
+  <w:comment w:id="269" w:author="Kouba, Claire" w:date="2026-06-10T14:34:00Z" w:initials="CK">
+    <w:p>
+      <w:pPr>
+        <w:pStyle w:val="CommentText"/>
+      </w:pPr>
+      <w:r>
+        <w:rPr>
+          <w:rStyle w:val="CommentReference"/>
+        </w:rPr>
+        <w:annotationRef/>
+      </w:r>
+      <w:r>
+        <w:t>Legend added in the Spp Info</w:t>
+      </w:r>
+    </w:p>
+  </w:comment>
+  <w:comment w:id="271" w:author="Leland Scantlebury" w:date="2026-05-18T15:16:00Z" w:initials="LS">
     <w:p>
       <w:r>
         <w:rPr>
@@ -23882,7 +24086,23 @@
       </w:r>
     </w:p>
   </w:comment>
-  <w:comment w:id="273" w:author="Leland Scantlebury" w:date="2026-05-18T15:29:00Z" w:initials="LS">
+  <w:comment w:id="272" w:author="Kouba, Claire" w:date="2026-06-10T14:34:00Z" w:initials="CK">
+    <w:p>
+      <w:pPr>
+        <w:pStyle w:val="CommentText"/>
+      </w:pPr>
+      <w:r>
+        <w:rPr>
+          <w:rStyle w:val="CommentReference"/>
+        </w:rPr>
+        <w:annotationRef/>
+      </w:r>
+      <w:r>
+        <w:t>That’s fair. I’ll see what Thomas says</w:t>
+      </w:r>
+    </w:p>
+  </w:comment>
+  <w:comment w:id="282" w:author="Leland Scantlebury" w:date="2026-05-18T15:29:00Z" w:initials="LS">
     <w:p>
       <w:r>
         <w:rPr>
@@ -23915,20 +24135,29 @@
   <w15:commentEx w15:paraId="2626E0ED" w15:paraIdParent="28AFC1AF" w15:done="0"/>
   <w15:commentEx w15:paraId="645EFB03" w15:done="0"/>
   <w15:commentEx w15:paraId="3C3E56D8" w15:done="0"/>
+  <w15:commentEx w15:paraId="46BA6760" w15:paraIdParent="3C3E56D8" w15:done="0"/>
   <w15:commentEx w15:paraId="7268CF3A" w15:done="0"/>
   <w15:commentEx w15:paraId="7C705FB0" w15:done="0"/>
+  <w15:commentEx w15:paraId="56775BA8" w15:paraIdParent="7C705FB0" w15:done="0"/>
   <w15:commentEx w15:paraId="353E522E" w15:done="0"/>
   <w15:commentEx w15:paraId="3BD7F0FD" w15:done="0"/>
+  <w15:commentEx w15:paraId="3B160FED" w15:paraIdParent="3BD7F0FD" w15:done="0"/>
   <w15:commentEx w15:paraId="25F55DA1" w15:done="0"/>
   <w15:commentEx w15:paraId="092E10F6" w15:done="0"/>
   <w15:commentEx w15:paraId="7F62EC4C" w15:done="0"/>
+  <w15:commentEx w15:paraId="0B5423A6" w15:paraIdParent="7F62EC4C" w15:done="0"/>
   <w15:commentEx w15:paraId="28FC24AB" w15:done="0"/>
   <w15:commentEx w15:paraId="2841BF08" w15:done="0"/>
   <w15:commentEx w15:paraId="317E50B8" w15:done="0"/>
+  <w15:commentEx w15:paraId="4F28B106" w15:paraIdParent="317E50B8" w15:done="0"/>
   <w15:commentEx w15:paraId="1745EECF" w15:done="0"/>
+  <w15:commentEx w15:paraId="34693966" w15:paraIdParent="1745EECF" w15:done="0"/>
   <w15:commentEx w15:paraId="57DACE10" w15:done="0"/>
+  <w15:commentEx w15:paraId="6388787E" w15:paraIdParent="57DACE10" w15:done="0"/>
   <w15:commentEx w15:paraId="103C2926" w15:done="0"/>
+  <w15:commentEx w15:paraId="55D6FEF6" w15:paraIdParent="103C2926" w15:done="0"/>
   <w15:commentEx w15:paraId="671A33C0" w15:done="0"/>
+  <w15:commentEx w15:paraId="56222DAC" w15:paraIdParent="671A33C0" w15:done="0"/>
   <w15:commentEx w15:paraId="35069A01" w15:done="0"/>
 </w15:commentsEx>
 </file>
@@ -24040,22 +24269,211 @@
     </w16cex:extLst>
   </w16cex:commentExtensible>
   <w16cex:commentExtensible w16cex:durableId="54DABBA4" w16cex:dateUtc="2026-05-18T17:48:00Z"/>
-  <w16cex:commentExtensible w16cex:durableId="4CDF1410" w16cex:dateUtc="2026-05-15T20:13:00Z"/>
-  <w16cex:commentExtensible w16cex:durableId="7A46D7A2" w16cex:dateUtc="2026-05-15T20:15:00Z"/>
-  <w16cex:commentExtensible w16cex:durableId="3FACAE64" w16cex:dateUtc="2026-05-15T20:35:00Z"/>
-  <w16cex:commentExtensible w16cex:durableId="5D23482C" w16cex:dateUtc="2026-05-18T17:39:00Z"/>
-  <w16cex:commentExtensible w16cex:durableId="6EEFA074" w16cex:dateUtc="2026-05-15T22:47:00Z"/>
-  <w16cex:commentExtensible w16cex:durableId="1DDFB528" w16cex:dateUtc="2026-05-18T17:25:00Z"/>
-  <w16cex:commentExtensible w16cex:durableId="1EF5FFE7" w16cex:dateUtc="2026-05-18T17:33:00Z"/>
-  <w16cex:commentExtensible w16cex:durableId="3E9310B3" w16cex:dateUtc="2026-05-18T17:30:00Z"/>
-  <w16cex:commentExtensible w16cex:durableId="77347261" w16cex:dateUtc="2026-05-18T17:49:00Z"/>
-  <w16cex:commentExtensible w16cex:durableId="20D93067" w16cex:dateUtc="2026-05-15T23:10:00Z"/>
-  <w16cex:commentExtensible w16cex:durableId="69E4114E" w16cex:dateUtc="2026-05-15T23:09:00Z"/>
-  <w16cex:commentExtensible w16cex:durableId="236819B3" w16cex:dateUtc="2026-05-18T21:59:00Z"/>
-  <w16cex:commentExtensible w16cex:durableId="169CF8B7" w16cex:dateUtc="2026-05-18T21:21:00Z"/>
-  <w16cex:commentExtensible w16cex:durableId="6EFAAD5F" w16cex:dateUtc="2026-05-18T21:30:00Z"/>
-  <w16cex:commentExtensible w16cex:durableId="3BE9785C" w16cex:dateUtc="2026-05-18T21:28:00Z"/>
+  <w16cex:commentExtensible w16cex:durableId="4CDF1410" w16cex:dateUtc="2026-05-15T20:13:00Z">
+    <w16cex:extLst>
+      <w16:ext w16:uri="{CE6994B0-6A32-4C9F-8C6B-6E91EDA988CE}">
+        <cr:reactions xmlns:cr="http://schemas.microsoft.com/office/comments/2020/reactions">
+          <cr:reaction reactionType="1">
+            <cr:reactionInfo dateUtc="2026-06-10T18:08:39Z">
+              <cr:user userId="S::claire.kouba@yale.edu::c8358bab-f754-450d-84bc-9b2fd87b4d1a" userProvider="AD" userName="Kouba, Claire"/>
+            </cr:reactionInfo>
+          </cr:reaction>
+        </cr:reactions>
+      </w16:ext>
+    </w16cex:extLst>
+  </w16cex:commentExtensible>
+  <w16cex:commentExtensible w16cex:durableId="7A46D7A2" w16cex:dateUtc="2026-05-15T20:15:00Z">
+    <w16cex:extLst>
+      <w16:ext w16:uri="{CE6994B0-6A32-4C9F-8C6B-6E91EDA988CE}">
+        <cr:reactions xmlns:cr="http://schemas.microsoft.com/office/comments/2020/reactions">
+          <cr:reaction reactionType="1">
+            <cr:reactionInfo dateUtc="2026-06-10T18:09:08Z">
+              <cr:user userId="S::claire.kouba@yale.edu::c8358bab-f754-450d-84bc-9b2fd87b4d1a" userProvider="AD" userName="Kouba, Claire"/>
+            </cr:reactionInfo>
+          </cr:reaction>
+        </cr:reactions>
+      </w16:ext>
+    </w16cex:extLst>
+  </w16cex:commentExtensible>
+  <w16cex:commentExtensible w16cex:durableId="05A8D16E" w16cex:dateUtc="2026-06-10T18:09:00Z"/>
+  <w16cex:commentExtensible w16cex:durableId="3FACAE64" w16cex:dateUtc="2026-05-15T20:35:00Z">
+    <w16cex:extLst>
+      <w16:ext w16:uri="{CE6994B0-6A32-4C9F-8C6B-6E91EDA988CE}">
+        <cr:reactions xmlns:cr="http://schemas.microsoft.com/office/comments/2020/reactions">
+          <cr:reaction reactionType="1">
+            <cr:reactionInfo dateUtc="2026-06-10T18:09:45Z">
+              <cr:user userId="S::claire.kouba@yale.edu::c8358bab-f754-450d-84bc-9b2fd87b4d1a" userProvider="AD" userName="Kouba, Claire"/>
+            </cr:reactionInfo>
+          </cr:reaction>
+        </cr:reactions>
+      </w16:ext>
+    </w16cex:extLst>
+  </w16cex:commentExtensible>
+  <w16cex:commentExtensible w16cex:durableId="5D23482C" w16cex:dateUtc="2026-05-18T17:39:00Z">
+    <w16cex:extLst>
+      <w16:ext w16:uri="{CE6994B0-6A32-4C9F-8C6B-6E91EDA988CE}">
+        <cr:reactions xmlns:cr="http://schemas.microsoft.com/office/comments/2020/reactions">
+          <cr:reaction reactionType="1">
+            <cr:reactionInfo dateUtc="2026-06-10T18:11:47Z">
+              <cr:user userId="S::claire.kouba@yale.edu::c8358bab-f754-450d-84bc-9b2fd87b4d1a" userProvider="AD" userName="Kouba, Claire"/>
+            </cr:reactionInfo>
+          </cr:reaction>
+        </cr:reactions>
+      </w16:ext>
+    </w16cex:extLst>
+  </w16cex:commentExtensible>
+  <w16cex:commentExtensible w16cex:durableId="3EFED055" w16cex:dateUtc="2026-06-10T18:11:00Z"/>
+  <w16cex:commentExtensible w16cex:durableId="6EEFA074" w16cex:dateUtc="2026-05-15T22:47:00Z">
+    <w16cex:extLst>
+      <w16:ext w16:uri="{CE6994B0-6A32-4C9F-8C6B-6E91EDA988CE}">
+        <cr:reactions xmlns:cr="http://schemas.microsoft.com/office/comments/2020/reactions">
+          <cr:reaction reactionType="1">
+            <cr:reactionInfo dateUtc="2026-06-10T18:18:11Z">
+              <cr:user userId="S::claire.kouba@yale.edu::c8358bab-f754-450d-84bc-9b2fd87b4d1a" userProvider="AD" userName="Kouba, Claire"/>
+            </cr:reactionInfo>
+          </cr:reaction>
+        </cr:reactions>
+      </w16:ext>
+    </w16cex:extLst>
+  </w16cex:commentExtensible>
+  <w16cex:commentExtensible w16cex:durableId="1DDFB528" w16cex:dateUtc="2026-05-18T17:25:00Z">
+    <w16cex:extLst>
+      <w16:ext w16:uri="{CE6994B0-6A32-4C9F-8C6B-6E91EDA988CE}">
+        <cr:reactions xmlns:cr="http://schemas.microsoft.com/office/comments/2020/reactions">
+          <cr:reaction reactionType="1">
+            <cr:reactionInfo dateUtc="2026-06-10T18:18:47Z">
+              <cr:user userId="S::claire.kouba@yale.edu::c8358bab-f754-450d-84bc-9b2fd87b4d1a" userProvider="AD" userName="Kouba, Claire"/>
+            </cr:reactionInfo>
+          </cr:reaction>
+        </cr:reactions>
+      </w16:ext>
+    </w16cex:extLst>
+  </w16cex:commentExtensible>
+  <w16cex:commentExtensible w16cex:durableId="0FCA1B8B" w16cex:dateUtc="2026-06-10T18:18:00Z"/>
+  <w16cex:commentExtensible w16cex:durableId="1EF5FFE7" w16cex:dateUtc="2026-05-18T17:33:00Z">
+    <w16cex:extLst>
+      <w16:ext w16:uri="{CE6994B0-6A32-4C9F-8C6B-6E91EDA988CE}">
+        <cr:reactions xmlns:cr="http://schemas.microsoft.com/office/comments/2020/reactions">
+          <cr:reaction reactionType="1">
+            <cr:reactionInfo dateUtc="2026-06-10T18:22:16Z">
+              <cr:user userId="S::claire.kouba@yale.edu::c8358bab-f754-450d-84bc-9b2fd87b4d1a" userProvider="AD" userName="Kouba, Claire"/>
+            </cr:reactionInfo>
+          </cr:reaction>
+        </cr:reactions>
+      </w16:ext>
+    </w16cex:extLst>
+  </w16cex:commentExtensible>
+  <w16cex:commentExtensible w16cex:durableId="3E9310B3" w16cex:dateUtc="2026-05-18T17:30:00Z">
+    <w16cex:extLst>
+      <w16:ext w16:uri="{CE6994B0-6A32-4C9F-8C6B-6E91EDA988CE}">
+        <cr:reactions xmlns:cr="http://schemas.microsoft.com/office/comments/2020/reactions">
+          <cr:reaction reactionType="1">
+            <cr:reactionInfo dateUtc="2026-06-10T18:22:20Z">
+              <cr:user userId="S::claire.kouba@yale.edu::c8358bab-f754-450d-84bc-9b2fd87b4d1a" userProvider="AD" userName="Kouba, Claire"/>
+            </cr:reactionInfo>
+          </cr:reaction>
+        </cr:reactions>
+      </w16:ext>
+    </w16cex:extLst>
+  </w16cex:commentExtensible>
+  <w16cex:commentExtensible w16cex:durableId="77347261" w16cex:dateUtc="2026-05-18T17:49:00Z">
+    <w16cex:extLst>
+      <w16:ext w16:uri="{CE6994B0-6A32-4C9F-8C6B-6E91EDA988CE}">
+        <cr:reactions xmlns:cr="http://schemas.microsoft.com/office/comments/2020/reactions">
+          <cr:reaction reactionType="1">
+            <cr:reactionInfo dateUtc="2026-06-10T18:27:40Z">
+              <cr:user userId="S::claire.kouba@yale.edu::c8358bab-f754-450d-84bc-9b2fd87b4d1a" userProvider="AD" userName="Kouba, Claire"/>
+            </cr:reactionInfo>
+          </cr:reaction>
+        </cr:reactions>
+      </w16:ext>
+    </w16cex:extLst>
+  </w16cex:commentExtensible>
+  <w16cex:commentExtensible w16cex:durableId="5A77F9DE" w16cex:dateUtc="2026-06-10T18:27:00Z"/>
+  <w16cex:commentExtensible w16cex:durableId="20D93067" w16cex:dateUtc="2026-05-15T23:10:00Z">
+    <w16cex:extLst>
+      <w16:ext w16:uri="{CE6994B0-6A32-4C9F-8C6B-6E91EDA988CE}">
+        <cr:reactions xmlns:cr="http://schemas.microsoft.com/office/comments/2020/reactions">
+          <cr:reaction reactionType="1">
+            <cr:reactionInfo dateUtc="2026-06-10T18:52:30Z">
+              <cr:user userId="S::claire.kouba@yale.edu::c8358bab-f754-450d-84bc-9b2fd87b4d1a" userProvider="AD" userName="Kouba, Claire"/>
+            </cr:reactionInfo>
+          </cr:reaction>
+        </cr:reactions>
+      </w16:ext>
+    </w16cex:extLst>
+  </w16cex:commentExtensible>
+  <w16cex:commentExtensible w16cex:durableId="69E4114E" w16cex:dateUtc="2026-05-15T23:09:00Z">
+    <w16cex:extLst>
+      <w16:ext w16:uri="{CE6994B0-6A32-4C9F-8C6B-6E91EDA988CE}">
+        <cr:reactions xmlns:cr="http://schemas.microsoft.com/office/comments/2020/reactions">
+          <cr:reaction reactionType="1">
+            <cr:reactionInfo dateUtc="2026-06-10T18:52:29Z">
+              <cr:user userId="S::claire.kouba@yale.edu::c8358bab-f754-450d-84bc-9b2fd87b4d1a" userProvider="AD" userName="Kouba, Claire"/>
+            </cr:reactionInfo>
+          </cr:reaction>
+        </cr:reactions>
+      </w16:ext>
+    </w16cex:extLst>
+  </w16cex:commentExtensible>
+  <w16cex:commentExtensible w16cex:durableId="236819B3" w16cex:dateUtc="2026-05-18T21:59:00Z">
+    <w16cex:extLst>
+      <w16:ext w16:uri="{CE6994B0-6A32-4C9F-8C6B-6E91EDA988CE}">
+        <cr:reactions xmlns:cr="http://schemas.microsoft.com/office/comments/2020/reactions">
+          <cr:reaction reactionType="1">
+            <cr:reactionInfo dateUtc="2026-06-10T19:41:58Z">
+              <cr:user userId="S::claire.kouba@yale.edu::c8358bab-f754-450d-84bc-9b2fd87b4d1a" userProvider="AD" userName="Kouba, Claire"/>
+            </cr:reactionInfo>
+          </cr:reaction>
+        </cr:reactions>
+      </w16:ext>
+    </w16cex:extLst>
+  </w16cex:commentExtensible>
+  <w16cex:commentExtensible w16cex:durableId="39BCFA8D" w16cex:dateUtc="2026-06-10T19:39:00Z"/>
+  <w16cex:commentExtensible w16cex:durableId="169CF8B7" w16cex:dateUtc="2026-05-18T21:21:00Z">
+    <w16cex:extLst>
+      <w16:ext w16:uri="{CE6994B0-6A32-4C9F-8C6B-6E91EDA988CE}">
+        <cr:reactions xmlns:cr="http://schemas.microsoft.com/office/comments/2020/reactions">
+          <cr:reaction reactionType="1">
+            <cr:reactionInfo dateUtc="2026-06-10T19:41:56Z">
+              <cr:user userId="S::claire.kouba@yale.edu::c8358bab-f754-450d-84bc-9b2fd87b4d1a" userProvider="AD" userName="Kouba, Claire"/>
+            </cr:reactionInfo>
+          </cr:reaction>
+        </cr:reactions>
+      </w16:ext>
+    </w16cex:extLst>
+  </w16cex:commentExtensible>
+  <w16cex:commentExtensible w16cex:durableId="60FC7342" w16cex:dateUtc="2026-06-10T22:11:00Z"/>
+  <w16cex:commentExtensible w16cex:durableId="6EFAAD5F" w16cex:dateUtc="2026-05-18T21:30:00Z">
+    <w16cex:extLst>
+      <w16:ext w16:uri="{CE6994B0-6A32-4C9F-8C6B-6E91EDA988CE}">
+        <cr:reactions xmlns:cr="http://schemas.microsoft.com/office/comments/2020/reactions">
+          <cr:reaction reactionType="1">
+            <cr:reactionInfo dateUtc="2026-06-10T21:33:56Z">
+              <cr:user userId="S::claire.kouba@yale.edu::c8358bab-f754-450d-84bc-9b2fd87b4d1a" userProvider="AD" userName="Kouba, Claire"/>
+            </cr:reactionInfo>
+          </cr:reaction>
+        </cr:reactions>
+      </w16:ext>
+    </w16cex:extLst>
+  </w16cex:commentExtensible>
+  <w16cex:commentExtensible w16cex:durableId="37EDA881" w16cex:dateUtc="2026-06-10T21:33:00Z"/>
+  <w16cex:commentExtensible w16cex:durableId="3BE9785C" w16cex:dateUtc="2026-05-18T21:28:00Z">
+    <w16cex:extLst>
+      <w16:ext w16:uri="{CE6994B0-6A32-4C9F-8C6B-6E91EDA988CE}">
+        <cr:reactions xmlns:cr="http://schemas.microsoft.com/office/comments/2020/reactions">
+          <cr:reaction reactionType="1">
+            <cr:reactionInfo dateUtc="2026-06-10T21:33:57Z">
+              <cr:user userId="S::claire.kouba@yale.edu::c8358bab-f754-450d-84bc-9b2fd87b4d1a" userProvider="AD" userName="Kouba, Claire"/>
+            </cr:reactionInfo>
+          </cr:reaction>
+        </cr:reactions>
+      </w16:ext>
+    </w16cex:extLst>
+  </w16cex:commentExtensible>
+  <w16cex:commentExtensible w16cex:durableId="2D126A3B" w16cex:dateUtc="2026-06-10T21:34:00Z"/>
   <w16cex:commentExtensible w16cex:durableId="0CC638B3" w16cex:dateUtc="2026-05-18T22:16:00Z"/>
+  <w16cex:commentExtensible w16cex:durableId="64EB67C0" w16cex:dateUtc="2026-06-10T21:34:00Z"/>
   <w16cex:commentExtensible w16cex:durableId="01539939" w16cex:dateUtc="2026-05-18T22:29:00Z"/>
 </w16cex:commentsExtensible>
 </file>
@@ -24073,20 +24491,29 @@
   <w16cid:commentId w16cid:paraId="2626E0ED" w16cid:durableId="54DABBA4"/>
   <w16cid:commentId w16cid:paraId="645EFB03" w16cid:durableId="4CDF1410"/>
   <w16cid:commentId w16cid:paraId="3C3E56D8" w16cid:durableId="7A46D7A2"/>
+  <w16cid:commentId w16cid:paraId="46BA6760" w16cid:durableId="05A8D16E"/>
   <w16cid:commentId w16cid:paraId="7268CF3A" w16cid:durableId="3FACAE64"/>
   <w16cid:commentId w16cid:paraId="7C705FB0" w16cid:durableId="5D23482C"/>
+  <w16cid:commentId w16cid:paraId="56775BA8" w16cid:durableId="3EFED055"/>
   <w16cid:commentId w16cid:paraId="353E522E" w16cid:durableId="6EEFA074"/>
   <w16cid:commentId w16cid:paraId="3BD7F0FD" w16cid:durableId="1DDFB528"/>
+  <w16cid:commentId w16cid:paraId="3B160FED" w16cid:durableId="0FCA1B8B"/>
   <w16cid:commentId w16cid:paraId="25F55DA1" w16cid:durableId="1EF5FFE7"/>
   <w16cid:commentId w16cid:paraId="092E10F6" w16cid:durableId="3E9310B3"/>
   <w16cid:commentId w16cid:paraId="7F62EC4C" w16cid:durableId="77347261"/>
+  <w16cid:commentId w16cid:paraId="0B5423A6" w16cid:durableId="5A77F9DE"/>
   <w16cid:commentId w16cid:paraId="28FC24AB" w16cid:durableId="20D93067"/>
   <w16cid:commentId w16cid:paraId="2841BF08" w16cid:durableId="69E4114E"/>
   <w16cid:commentId w16cid:paraId="317E50B8" w16cid:durableId="236819B3"/>
+  <w16cid:commentId w16cid:paraId="4F28B106" w16cid:durableId="39BCFA8D"/>
   <w16cid:commentId w16cid:paraId="1745EECF" w16cid:durableId="169CF8B7"/>
+  <w16cid:commentId w16cid:paraId="34693966" w16cid:durableId="60FC7342"/>
   <w16cid:commentId w16cid:paraId="57DACE10" w16cid:durableId="6EFAAD5F"/>
+  <w16cid:commentId w16cid:paraId="6388787E" w16cid:durableId="37EDA881"/>
   <w16cid:commentId w16cid:paraId="103C2926" w16cid:durableId="3BE9785C"/>
+  <w16cid:commentId w16cid:paraId="55D6FEF6" w16cid:durableId="2D126A3B"/>
   <w16cid:commentId w16cid:paraId="671A33C0" w16cid:durableId="0CC638B3"/>
+  <w16cid:commentId w16cid:paraId="56222DAC" w16cid:durableId="64EB67C0"/>
   <w16cid:commentId w16cid:paraId="35069A01" w16cid:durableId="01539939"/>
 </w16cid:commentsIds>
 </file>
@@ -24605,6 +25032,9 @@
 <w15:people xmlns:wpc="http://schemas.microsoft.com/office/word/2010/wordprocessingCanvas" xmlns:cx="http://schemas.microsoft.com/office/drawing/2014/chartex" xmlns:cx1="http://schemas.microsoft.com/office/drawing/2015/9/8/chartex" xmlns:cx2="http://schemas.microsoft.com/office/drawing/2015/10/21/chartex" xmlns:cx3="http://schemas.microsoft.com/office/drawing/2016/5/9/chartex" xmlns:cx4="http://schemas.microsoft.com/office/drawing/2016/5/10/chartex" xmlns:cx5="http://schemas.microsoft.com/office/drawing/2016/5/11/chartex" xmlns:cx6="http://schemas.microsoft.com/office/drawing/2016/5/12/chartex" xmlns:cx7="http://schemas.microsoft.com/office/drawing/2016/5/13/chartex" xmlns:cx8="http://schemas.microsoft.com/office/drawing/2016/5/14/chartex" xmlns:mc="http://schemas.openxmlformats.org/markup-compatibility/2006" xmlns:aink="http://schemas.microsoft.com/office/drawing/2016/ink" xmlns:am3d="http://schemas.microsoft.com/office/drawing/2017/model3d" xmlns:o="urn:schemas-microsoft-com:office:office" xmlns:oel="http://schemas.microsoft.com/office/2019/extlst" xmlns:r="http://schemas.openxmlformats.org/officeDocument/2006/relationships" xmlns:m="http://schemas.openxmlformats.org/officeDocument/2006/math" xmlns:v="urn:schemas-microsoft-com:vml" xmlns:wp14="http://schemas.microsoft.com/office/word/2010/wordprocessingDrawing" xmlns:wp="http://schemas.openxmlformats.org/drawingml/2006/wordprocessingDrawing" xmlns:w10="urn:schemas-microsoft-com:office:word" xmlns:w="http://schemas.openxmlformats.org/wordprocessingml/2006/main" xmlns:w14="http://schemas.microsoft.com/office/word/2010/wordml" xmlns:w15="http://schemas.microsoft.com/office/word/2012/wordml" xmlns:w16cex="http://schemas.microsoft.com/office/word/2018/wordml/cex" xmlns:w16cid="http://schemas.microsoft.com/office/word/2016/wordml/cid" xmlns:w16="http://schemas.microsoft.com/office/word/2018/wordml" xmlns:w16du="http://schemas.microsoft.com/office/word/2023/wordml/word16du" xmlns:w16sdtdh="http://schemas.microsoft.com/office/word/2020/wordml/sdtdatahash" xmlns:w16se="http://schemas.microsoft.com/office/word/2015/wordml/symex" xmlns:wpg="http://schemas.microsoft.com/office/word/2010/wordprocessingGroup" xmlns:wpi="http://schemas.microsoft.com/office/word/2010/wordprocessingInk" xmlns:wne="http://schemas.microsoft.com/office/word/2006/wordml" xmlns:wps="http://schemas.microsoft.com/office/word/2010/wordprocessingShape" mc:Ignorable="w14 w15 w16se w16cid w16 w16cex w16sdtdh w16du wp14">
   <w15:person w15:author="Leland Scantlebury">
     <w15:presenceInfo w15:providerId="None" w15:userId="Leland Scantlebury"/>
+  </w15:person>
+  <w15:person w15:author="Kouba, Claire">
+    <w15:presenceInfo w15:providerId="AD" w15:userId="S::claire.kouba@yale.edu::c8358bab-f754-450d-84bc-9b2fd87b4d1a"/>
   </w15:person>
 </w15:people>
 </file>

</xml_diff>